<commit_message>
Migrate View Subjects and Add Subject to MySQL
</commit_message>
<xml_diff>
--- a/_AI_STUDY_ASSISTANT_.docx
+++ b/_AI_STUDY_ASSISTANT_.docx
@@ -121,8 +121,366 @@
         <w:t>The proposed system can help make studying more organized, interactive, and personalized while providing a practical platform for exploring and applying concepts from Computer Science, Artificial Intelligence, and Machine Learning.</w:t>
       </w:r>
     </w:p>
+    <w:p>
+      <w:pPr>
+        <w:rPr>
+          <w:color w:val="1F2937"/>
+          <w:sz w:val="26"/>
+          <w:szCs w:val="26"/>
+        </w:rPr>
+        <w:sectPr>
+          <w:headerReference w:type="default" r:id="rId7"/>
+          <w:pgSz w:w="11906" w:h="16838" w:code="9"/>
+          <w:pgMar w:top="1077" w:right="1077" w:bottom="1077" w:left="1440" w:header="709" w:footer="709" w:gutter="0"/>
+          <w:pgBorders w:offsetFrom="page">
+            <w:top w:val="single" w:sz="4" w:space="24" w:color="auto"/>
+            <w:left w:val="single" w:sz="4" w:space="24" w:color="auto"/>
+            <w:bottom w:val="single" w:sz="4" w:space="24" w:color="auto"/>
+            <w:right w:val="single" w:sz="4" w:space="24" w:color="auto"/>
+          </w:pgBorders>
+          <w:cols w:space="708"/>
+          <w:docGrid w:linePitch="360"/>
+        </w:sectPr>
+      </w:pPr>
+    </w:p>
+    <w:p>
+      <w:pPr>
+        <w:spacing w:line="276" w:lineRule="auto"/>
+        <w:jc w:val="both"/>
+        <w:rPr>
+          <w:color w:val="1F2937"/>
+          <w:sz w:val="26"/>
+          <w:szCs w:val="26"/>
+        </w:rPr>
+      </w:pPr>
+    </w:p>
+    <w:p>
+      <w:pPr>
+        <w:spacing w:line="276" w:lineRule="auto"/>
+        <w:jc w:val="both"/>
+        <w:rPr>
+          <w:color w:val="1F2937"/>
+          <w:sz w:val="26"/>
+          <w:szCs w:val="26"/>
+        </w:rPr>
+      </w:pPr>
+      <w:r>
+        <w:rPr>
+          <w:color w:val="1F2937"/>
+          <w:sz w:val="26"/>
+          <w:szCs w:val="26"/>
+        </w:rPr>
+        <w:t>In today’s education system, students have access to a large amount of study material in the form of notes, PDFs, websites, videos, assignments, and online resources. Although these resources make learning easier, managing all of them properly can become difficult. Students often keep their study material in different folders, applications, notebooks, or websites. Because of this, finding the right material at the right time can take unnecessary effort. Along with studying the actual subject, students also have to spend time organizing their notes, remembering important topics, preparing for tests, and keeping track of their progress.</w:t>
+      </w:r>
+    </w:p>
+    <w:p>
+      <w:pPr>
+        <w:spacing w:line="276" w:lineRule="auto"/>
+        <w:jc w:val="both"/>
+        <w:rPr>
+          <w:color w:val="1F2937"/>
+          <w:sz w:val="26"/>
+          <w:szCs w:val="26"/>
+        </w:rPr>
+      </w:pPr>
+    </w:p>
+    <w:p>
+      <w:pPr>
+        <w:spacing w:line="276" w:lineRule="auto"/>
+        <w:jc w:val="both"/>
+        <w:rPr>
+          <w:color w:val="1F2937"/>
+          <w:sz w:val="26"/>
+          <w:szCs w:val="26"/>
+        </w:rPr>
+      </w:pPr>
+      <w:r>
+        <w:rPr>
+          <w:color w:val="1F2937"/>
+          <w:sz w:val="26"/>
+          <w:szCs w:val="26"/>
+        </w:rPr>
+        <w:t>The AI Study Assistant is proposed as a software system that aims to make the process of managing study material simpler and more organized. The basic idea of the project is to provide students with a single platform where they can organize their subjects and store their notes in a structured way. Instead of keeping information scattered across different places, a student can create subjects, add study material, save notes, and access them whenever required. This provides a simple foundation for developing a more advanced learning system in the future.</w:t>
+      </w:r>
+    </w:p>
+    <w:p>
+      <w:pPr>
+        <w:spacing w:line="276" w:lineRule="auto"/>
+        <w:jc w:val="both"/>
+        <w:rPr>
+          <w:color w:val="1F2937"/>
+          <w:sz w:val="26"/>
+          <w:szCs w:val="26"/>
+        </w:rPr>
+      </w:pPr>
+    </w:p>
+    <w:p>
+      <w:pPr>
+        <w:spacing w:line="276" w:lineRule="auto"/>
+        <w:jc w:val="both"/>
+        <w:rPr>
+          <w:color w:val="1F2937"/>
+          <w:sz w:val="26"/>
+          <w:szCs w:val="26"/>
+        </w:rPr>
+      </w:pPr>
+      <w:r>
+        <w:rPr>
+          <w:color w:val="1F2937"/>
+          <w:sz w:val="26"/>
+          <w:szCs w:val="26"/>
+        </w:rPr>
+        <w:t>The initial version of the project focuses mainly on the basic requirements of a student. A student can create and manage different subjects and store notes according to those subjects. The system can also allow saved information to be viewed when required. These features may appear simple, but they form an important base for a larger study-assistance system. Proper organization of study material is necessary before more advanced features such as automatic question generation, summaries, quizzes, and progress analysis can be added.</w:t>
+      </w:r>
+    </w:p>
+    <w:p>
+      <w:pPr>
+        <w:spacing w:line="276" w:lineRule="auto"/>
+        <w:jc w:val="both"/>
+        <w:rPr>
+          <w:color w:val="1F2937"/>
+          <w:sz w:val="26"/>
+          <w:szCs w:val="26"/>
+        </w:rPr>
+      </w:pPr>
+    </w:p>
+    <w:p>
+      <w:pPr>
+        <w:spacing w:line="276" w:lineRule="auto"/>
+        <w:jc w:val="both"/>
+        <w:rPr>
+          <w:color w:val="1F2937"/>
+          <w:sz w:val="26"/>
+          <w:szCs w:val="26"/>
+        </w:rPr>
+        <w:sectPr>
+          <w:headerReference w:type="default" r:id="rId8"/>
+          <w:pgSz w:w="11906" w:h="16838" w:code="9"/>
+          <w:pgMar w:top="1077" w:right="1077" w:bottom="1077" w:left="1440" w:header="709" w:footer="709" w:gutter="0"/>
+          <w:pgBorders w:offsetFrom="page">
+            <w:top w:val="single" w:sz="4" w:space="24" w:color="auto"/>
+            <w:left w:val="single" w:sz="4" w:space="24" w:color="auto"/>
+            <w:bottom w:val="single" w:sz="4" w:space="24" w:color="auto"/>
+            <w:right w:val="single" w:sz="4" w:space="24" w:color="auto"/>
+          </w:pgBorders>
+          <w:cols w:space="708"/>
+          <w:docGrid w:linePitch="360"/>
+        </w:sectPr>
+      </w:pPr>
+      <w:r>
+        <w:rPr>
+          <w:color w:val="1F2937"/>
+          <w:sz w:val="26"/>
+          <w:szCs w:val="26"/>
+        </w:rPr>
+        <w:t>The project is also designed with future development in mind. As the system develops, Artificial Intelligence can be introduced to make the assistant more useful and interactive. Instead of only storing information, the system can eventually understand the student's study material and help the student learn from it. For example, AI-based features could be used to generate questions from notes, create short summaries of lengthy material, identify important topics, and provide study recommendations. Natural Language Processing (NLP) can also help the system</w:t>
+      </w:r>
+    </w:p>
+    <w:p>
+      <w:pPr>
+        <w:spacing w:line="276" w:lineRule="auto"/>
+        <w:jc w:val="both"/>
+        <w:rPr>
+          <w:color w:val="1F2937"/>
+          <w:sz w:val="26"/>
+          <w:szCs w:val="26"/>
+        </w:rPr>
+      </w:pPr>
+      <w:r>
+        <w:rPr>
+          <w:color w:val="1F2937"/>
+          <w:sz w:val="26"/>
+          <w:szCs w:val="26"/>
+        </w:rPr>
+        <w:lastRenderedPageBreak/>
+        <w:t xml:space="preserve"> understand questions written in normal human language and provide relevant responses.</w:t>
+      </w:r>
+    </w:p>
+    <w:p>
+      <w:pPr>
+        <w:spacing w:line="276" w:lineRule="auto"/>
+        <w:jc w:val="both"/>
+        <w:rPr>
+          <w:color w:val="1F2937"/>
+          <w:sz w:val="26"/>
+          <w:szCs w:val="26"/>
+        </w:rPr>
+      </w:pPr>
+    </w:p>
+    <w:p>
+      <w:pPr>
+        <w:spacing w:line="276" w:lineRule="auto"/>
+        <w:jc w:val="both"/>
+        <w:rPr>
+          <w:color w:val="1F2937"/>
+          <w:sz w:val="26"/>
+          <w:szCs w:val="26"/>
+        </w:rPr>
+      </w:pPr>
+      <w:r>
+        <w:rPr>
+          <w:color w:val="1F2937"/>
+          <w:sz w:val="26"/>
+          <w:szCs w:val="26"/>
+        </w:rPr>
+        <w:t>Another important aspect of the project is personalization. Every student has different subjects, study material, learning requirements, and areas where they need more practice. A future version of the AI Study Assistant can use the student's interaction with the system to provide more personalized assistance. For example, if a student frequently practices a particular topic or has difficulty with certain types of questions, the system could use this information to suggest relevant study material or additional practice. This can gradually transform the project from a simple storage system into a personalized digital learning companion.</w:t>
+      </w:r>
+    </w:p>
+    <w:p>
+      <w:pPr>
+        <w:spacing w:line="276" w:lineRule="auto"/>
+        <w:jc w:val="both"/>
+        <w:rPr>
+          <w:color w:val="1F2937"/>
+          <w:sz w:val="26"/>
+          <w:szCs w:val="26"/>
+        </w:rPr>
+      </w:pPr>
+    </w:p>
+    <w:p>
+      <w:pPr>
+        <w:spacing w:line="276" w:lineRule="auto"/>
+        <w:jc w:val="both"/>
+        <w:rPr>
+          <w:color w:val="1F2937"/>
+          <w:sz w:val="26"/>
+          <w:szCs w:val="26"/>
+        </w:rPr>
+      </w:pPr>
+      <w:r>
+        <w:rPr>
+          <w:color w:val="1F2937"/>
+          <w:sz w:val="26"/>
+          <w:szCs w:val="26"/>
+        </w:rPr>
+        <w:t>From a technical point of view, the project also provides an opportunity to understand how different technologies can be combined to create a useful application. The initial development can be carried out using Python, while a database such as MySQL can be used for storing structured information. As the project becomes more advanced, concepts related to Artificial Intelligence, Machine Learning, NLP, Large Language Models (LLMs), and Retrieval-Augmented Generation (RAG) can be explored and integrated where appropriate.</w:t>
+      </w:r>
+    </w:p>
+    <w:p>
+      <w:pPr>
+        <w:spacing w:line="276" w:lineRule="auto"/>
+        <w:jc w:val="both"/>
+        <w:rPr>
+          <w:color w:val="1F2937"/>
+          <w:sz w:val="26"/>
+          <w:szCs w:val="26"/>
+        </w:rPr>
+      </w:pPr>
+    </w:p>
+    <w:p>
+      <w:pPr>
+        <w:spacing w:line="276" w:lineRule="auto"/>
+        <w:jc w:val="both"/>
+        <w:rPr>
+          <w:color w:val="1F2937"/>
+          <w:sz w:val="26"/>
+          <w:szCs w:val="26"/>
+        </w:rPr>
+      </w:pPr>
+      <w:r>
+        <w:rPr>
+          <w:color w:val="1F2937"/>
+          <w:sz w:val="26"/>
+          <w:szCs w:val="26"/>
+        </w:rPr>
+        <w:t>The development of the project can therefore be viewed as a gradual process rather than trying to build a complete AI system at once. The basic version provides the essential functionality for managing study material, while future versions can introduce intelligent features step by step. This approach makes the project easier to understand, test, improve, and expand throughout the development process.</w:t>
+      </w:r>
+    </w:p>
+    <w:p>
+      <w:pPr>
+        <w:spacing w:line="276" w:lineRule="auto"/>
+        <w:jc w:val="both"/>
+        <w:rPr>
+          <w:color w:val="1F2937"/>
+          <w:sz w:val="26"/>
+          <w:szCs w:val="26"/>
+        </w:rPr>
+      </w:pPr>
+    </w:p>
+    <w:p>
+      <w:pPr>
+        <w:spacing w:line="276" w:lineRule="auto"/>
+        <w:jc w:val="both"/>
+        <w:rPr>
+          <w:color w:val="1F2937"/>
+          <w:sz w:val="26"/>
+          <w:szCs w:val="26"/>
+        </w:rPr>
+        <w:sectPr>
+          <w:headerReference w:type="default" r:id="rId9"/>
+          <w:pgSz w:w="11906" w:h="16838" w:code="9"/>
+          <w:pgMar w:top="1077" w:right="1077" w:bottom="1077" w:left="1440" w:header="709" w:footer="709" w:gutter="0"/>
+          <w:pgBorders w:offsetFrom="page">
+            <w:top w:val="single" w:sz="4" w:space="24" w:color="auto"/>
+            <w:left w:val="single" w:sz="4" w:space="24" w:color="auto"/>
+            <w:bottom w:val="single" w:sz="4" w:space="24" w:color="auto"/>
+            <w:right w:val="single" w:sz="4" w:space="24" w:color="auto"/>
+          </w:pgBorders>
+          <w:cols w:space="708"/>
+          <w:docGrid w:linePitch="360"/>
+        </w:sectPr>
+      </w:pPr>
+      <w:r>
+        <w:rPr>
+          <w:color w:val="1F2937"/>
+          <w:sz w:val="26"/>
+          <w:szCs w:val="26"/>
+        </w:rPr>
+        <w:t>The main purpose of the AI Study Assistant is not simply to replace traditional methods of studying. Instead, it is intended to support students by reducing the effort required to organize information and by providing useful assistance during the learning process. A well-organized digital system can help students spend more time actually understanding their subjects instead of searching through different sources for their notes and study material</w:t>
+      </w:r>
+    </w:p>
+    <w:p>
+      <w:pPr>
+        <w:spacing w:line="276" w:lineRule="auto"/>
+        <w:jc w:val="both"/>
+        <w:rPr>
+          <w:color w:val="1F2937"/>
+          <w:sz w:val="26"/>
+          <w:szCs w:val="26"/>
+        </w:rPr>
+      </w:pPr>
+      <w:r>
+        <w:rPr>
+          <w:color w:val="1F2937"/>
+          <w:sz w:val="26"/>
+          <w:szCs w:val="26"/>
+        </w:rPr>
+        <w:lastRenderedPageBreak/>
+        <w:t>In the long term, the project aims to develop into a system that combines study-material management with AI-based assistance. The idea is to start with simple and practical features and gradually introduce intelligent capabilities as the project develops. This makes the AI Study Assistant a suitable project for exploring both software development and the practical applications of Artificial Intelligence in education.</w:t>
+      </w:r>
+    </w:p>
+    <w:p>
+      <w:pPr>
+        <w:spacing w:line="276" w:lineRule="auto"/>
+        <w:jc w:val="both"/>
+        <w:rPr>
+          <w:color w:val="1F2937"/>
+          <w:sz w:val="26"/>
+          <w:szCs w:val="26"/>
+        </w:rPr>
+      </w:pPr>
+    </w:p>
+    <w:p>
+      <w:pPr>
+        <w:spacing w:line="276" w:lineRule="auto"/>
+        <w:jc w:val="both"/>
+        <w:rPr>
+          <w:color w:val="1F2937"/>
+          <w:sz w:val="26"/>
+          <w:szCs w:val="26"/>
+        </w:rPr>
+      </w:pPr>
+      <w:r>
+        <w:rPr>
+          <w:color w:val="1F2937"/>
+          <w:sz w:val="26"/>
+          <w:szCs w:val="26"/>
+        </w:rPr>
+        <w:t>Overall, the AI Study Assistant is proposed as a student-oriented platform that begins with a simple problem—organizing study material—and gradually works towards a more intelligent solution. By combining structured data management with future AI capabilities, the project can provide a foundation for a personalized learning environment where students can store, access, understand, and practice their study material more effectively.</w:t>
+      </w:r>
+    </w:p>
     <w:sectPr>
-      <w:headerReference w:type="default" r:id="rId6"/>
+      <w:headerReference w:type="default" r:id="rId10"/>
       <w:pgSz w:w="11906" w:h="16838" w:code="9"/>
       <w:pgMar w:top="1077" w:right="1077" w:bottom="1077" w:left="1440" w:header="709" w:footer="709" w:gutter="0"/>
       <w:pgBorders w:offsetFrom="page">
@@ -214,8 +572,90 @@
         <w:szCs w:val="56"/>
         <w:lang w:val="en-US"/>
       </w:rPr>
-      <w:t>ABSTRACT</w:t>
+      <w:t>ABSTRAC</w:t>
     </w:r>
+    <w:r>
+      <w:rPr>
+        <w:rFonts w:asciiTheme="majorHAnsi" w:hAnsiTheme="majorHAnsi" w:cs="Calibri"/>
+        <w:b/>
+        <w:bCs/>
+        <w:color w:val="172554"/>
+        <w:sz w:val="56"/>
+        <w:szCs w:val="56"/>
+        <w:lang w:val="en-US"/>
+      </w:rPr>
+      <w:t>T</w:t>
+    </w:r>
+  </w:p>
+</w:hdr>
+</file>
+
+<file path=word/header2.xml><?xml version="1.0" encoding="utf-8"?>
+<w:hdr xmlns:wpc="http://schemas.microsoft.com/office/word/2010/wordprocessingCanvas" xmlns:cx="http://schemas.microsoft.com/office/drawing/2014/chartex" xmlns:cx1="http://schemas.microsoft.com/office/drawing/2015/9/8/chartex" xmlns:cx2="http://schemas.microsoft.com/office/drawing/2015/10/21/chartex" xmlns:cx3="http://schemas.microsoft.com/office/drawing/2016/5/9/chartex" xmlns:cx4="http://schemas.microsoft.com/office/drawing/2016/5/10/chartex" xmlns:cx5="http://schemas.microsoft.com/office/drawing/2016/5/11/chartex" xmlns:cx6="http://schemas.microsoft.com/office/drawing/2016/5/12/chartex" xmlns:cx7="http://schemas.microsoft.com/office/drawing/2016/5/13/chartex" xmlns:cx8="http://schemas.microsoft.com/office/drawing/2016/5/14/chartex" xmlns:mc="http://schemas.openxmlformats.org/markup-compatibility/2006" xmlns:aink="http://schemas.microsoft.com/office/drawing/2016/ink" xmlns:am3d="http://schemas.microsoft.com/office/drawing/2017/model3d" xmlns:o="urn:schemas-microsoft-com:office:office" xmlns:oel="http://schemas.microsoft.com/office/2019/extlst" xmlns:r="http://schemas.openxmlformats.org/officeDocument/2006/relationships" xmlns:m="http://schemas.openxmlformats.org/officeDocument/2006/math" xmlns:v="urn:schemas-microsoft-com:vml" xmlns:wp14="http://schemas.microsoft.com/office/word/2010/wordprocessingDrawing" xmlns:wp="http://schemas.openxmlformats.org/drawingml/2006/wordprocessingDrawing" xmlns:w10="urn:schemas-microsoft-com:office:word" xmlns:w="http://schemas.openxmlformats.org/wordprocessingml/2006/main" xmlns:w14="http://schemas.microsoft.com/office/word/2010/wordml" xmlns:w15="http://schemas.microsoft.com/office/word/2012/wordml" xmlns:w16cex="http://schemas.microsoft.com/office/word/2018/wordml/cex" xmlns:w16cid="http://schemas.microsoft.com/office/word/2016/wordml/cid" xmlns:w16="http://schemas.microsoft.com/office/word/2018/wordml" xmlns:w16du="http://schemas.microsoft.com/office/word/2023/wordml/word16du" xmlns:w16sdtdh="http://schemas.microsoft.com/office/word/2020/wordml/sdtdatahash" xmlns:w16sdtfl="http://schemas.microsoft.com/office/word/2024/wordml/sdtformatlock" xmlns:w16se="http://schemas.microsoft.com/office/word/2015/wordml/symex" xmlns:wpg="http://schemas.microsoft.com/office/word/2010/wordprocessingGroup" xmlns:wpi="http://schemas.microsoft.com/office/word/2010/wordprocessingInk" xmlns:wne="http://schemas.microsoft.com/office/word/2006/wordml" xmlns:wps="http://schemas.microsoft.com/office/word/2010/wordprocessingShape" mc:Ignorable="w14 w15 w16se w16cid w16 w16cex w16sdtdh w16sdtfl w16du wp14">
+  <w:p>
+    <w:pPr>
+      <w:pStyle w:val="Header"/>
+      <w:jc w:val="center"/>
+      <w:rPr>
+        <w:rFonts w:asciiTheme="majorHAnsi" w:hAnsiTheme="majorHAnsi" w:cs="Calibri"/>
+        <w:b/>
+        <w:bCs/>
+        <w:color w:val="172554"/>
+        <w:sz w:val="56"/>
+        <w:szCs w:val="56"/>
+        <w:lang w:val="en-US"/>
+      </w:rPr>
+    </w:pPr>
+    <w:r>
+      <w:rPr>
+        <w:rFonts w:asciiTheme="majorHAnsi" w:hAnsiTheme="majorHAnsi" w:cs="Calibri"/>
+        <w:b/>
+        <w:bCs/>
+        <w:color w:val="172554"/>
+        <w:sz w:val="56"/>
+        <w:szCs w:val="56"/>
+        <w:lang w:val="en-US"/>
+      </w:rPr>
+      <w:t>INTRODUCTION</w:t>
+    </w:r>
+  </w:p>
+</w:hdr>
+</file>
+
+<file path=word/header3.xml><?xml version="1.0" encoding="utf-8"?>
+<w:hdr xmlns:wpc="http://schemas.microsoft.com/office/word/2010/wordprocessingCanvas" xmlns:cx="http://schemas.microsoft.com/office/drawing/2014/chartex" xmlns:cx1="http://schemas.microsoft.com/office/drawing/2015/9/8/chartex" xmlns:cx2="http://schemas.microsoft.com/office/drawing/2015/10/21/chartex" xmlns:cx3="http://schemas.microsoft.com/office/drawing/2016/5/9/chartex" xmlns:cx4="http://schemas.microsoft.com/office/drawing/2016/5/10/chartex" xmlns:cx5="http://schemas.microsoft.com/office/drawing/2016/5/11/chartex" xmlns:cx6="http://schemas.microsoft.com/office/drawing/2016/5/12/chartex" xmlns:cx7="http://schemas.microsoft.com/office/drawing/2016/5/13/chartex" xmlns:cx8="http://schemas.microsoft.com/office/drawing/2016/5/14/chartex" xmlns:mc="http://schemas.openxmlformats.org/markup-compatibility/2006" xmlns:aink="http://schemas.microsoft.com/office/drawing/2016/ink" xmlns:am3d="http://schemas.microsoft.com/office/drawing/2017/model3d" xmlns:o="urn:schemas-microsoft-com:office:office" xmlns:oel="http://schemas.microsoft.com/office/2019/extlst" xmlns:r="http://schemas.openxmlformats.org/officeDocument/2006/relationships" xmlns:m="http://schemas.openxmlformats.org/officeDocument/2006/math" xmlns:v="urn:schemas-microsoft-com:vml" xmlns:wp14="http://schemas.microsoft.com/office/word/2010/wordprocessingDrawing" xmlns:wp="http://schemas.openxmlformats.org/drawingml/2006/wordprocessingDrawing" xmlns:w10="urn:schemas-microsoft-com:office:word" xmlns:w="http://schemas.openxmlformats.org/wordprocessingml/2006/main" xmlns:w14="http://schemas.microsoft.com/office/word/2010/wordml" xmlns:w15="http://schemas.microsoft.com/office/word/2012/wordml" xmlns:w16cex="http://schemas.microsoft.com/office/word/2018/wordml/cex" xmlns:w16cid="http://schemas.microsoft.com/office/word/2016/wordml/cid" xmlns:w16="http://schemas.microsoft.com/office/word/2018/wordml" xmlns:w16du="http://schemas.microsoft.com/office/word/2023/wordml/word16du" xmlns:w16sdtdh="http://schemas.microsoft.com/office/word/2020/wordml/sdtdatahash" xmlns:w16sdtfl="http://schemas.microsoft.com/office/word/2024/wordml/sdtformatlock" xmlns:w16se="http://schemas.microsoft.com/office/word/2015/wordml/symex" xmlns:wpg="http://schemas.microsoft.com/office/word/2010/wordprocessingGroup" xmlns:wpi="http://schemas.microsoft.com/office/word/2010/wordprocessingInk" xmlns:wne="http://schemas.microsoft.com/office/word/2006/wordml" xmlns:wps="http://schemas.microsoft.com/office/word/2010/wordprocessingShape" mc:Ignorable="w14 w15 w16se w16cid w16 w16cex w16sdtdh w16sdtfl w16du wp14">
+  <w:p>
+    <w:pPr>
+      <w:pStyle w:val="Header"/>
+      <w:rPr>
+        <w:rFonts w:asciiTheme="majorHAnsi" w:hAnsiTheme="majorHAnsi" w:cs="Calibri"/>
+        <w:b/>
+        <w:bCs/>
+        <w:color w:val="172554"/>
+        <w:sz w:val="56"/>
+        <w:szCs w:val="56"/>
+        <w:lang w:val="en-US"/>
+      </w:rPr>
+    </w:pPr>
+  </w:p>
+</w:hdr>
+</file>
+
+<file path=word/header4.xml><?xml version="1.0" encoding="utf-8"?>
+<w:hdr xmlns:wpc="http://schemas.microsoft.com/office/word/2010/wordprocessingCanvas" xmlns:cx="http://schemas.microsoft.com/office/drawing/2014/chartex" xmlns:cx1="http://schemas.microsoft.com/office/drawing/2015/9/8/chartex" xmlns:cx2="http://schemas.microsoft.com/office/drawing/2015/10/21/chartex" xmlns:cx3="http://schemas.microsoft.com/office/drawing/2016/5/9/chartex" xmlns:cx4="http://schemas.microsoft.com/office/drawing/2016/5/10/chartex" xmlns:cx5="http://schemas.microsoft.com/office/drawing/2016/5/11/chartex" xmlns:cx6="http://schemas.microsoft.com/office/drawing/2016/5/12/chartex" xmlns:cx7="http://schemas.microsoft.com/office/drawing/2016/5/13/chartex" xmlns:cx8="http://schemas.microsoft.com/office/drawing/2016/5/14/chartex" xmlns:mc="http://schemas.openxmlformats.org/markup-compatibility/2006" xmlns:aink="http://schemas.microsoft.com/office/drawing/2016/ink" xmlns:am3d="http://schemas.microsoft.com/office/drawing/2017/model3d" xmlns:o="urn:schemas-microsoft-com:office:office" xmlns:oel="http://schemas.microsoft.com/office/2019/extlst" xmlns:r="http://schemas.openxmlformats.org/officeDocument/2006/relationships" xmlns:m="http://schemas.openxmlformats.org/officeDocument/2006/math" xmlns:v="urn:schemas-microsoft-com:vml" xmlns:wp14="http://schemas.microsoft.com/office/word/2010/wordprocessingDrawing" xmlns:wp="http://schemas.openxmlformats.org/drawingml/2006/wordprocessingDrawing" xmlns:w10="urn:schemas-microsoft-com:office:word" xmlns:w="http://schemas.openxmlformats.org/wordprocessingml/2006/main" xmlns:w14="http://schemas.microsoft.com/office/word/2010/wordml" xmlns:w15="http://schemas.microsoft.com/office/word/2012/wordml" xmlns:w16cex="http://schemas.microsoft.com/office/word/2018/wordml/cex" xmlns:w16cid="http://schemas.microsoft.com/office/word/2016/wordml/cid" xmlns:w16="http://schemas.microsoft.com/office/word/2018/wordml" xmlns:w16du="http://schemas.microsoft.com/office/word/2023/wordml/word16du" xmlns:w16sdtdh="http://schemas.microsoft.com/office/word/2020/wordml/sdtdatahash" xmlns:w16sdtfl="http://schemas.microsoft.com/office/word/2024/wordml/sdtformatlock" xmlns:w16se="http://schemas.microsoft.com/office/word/2015/wordml/symex" xmlns:wpg="http://schemas.microsoft.com/office/word/2010/wordprocessingGroup" xmlns:wpi="http://schemas.microsoft.com/office/word/2010/wordprocessingInk" xmlns:wne="http://schemas.microsoft.com/office/word/2006/wordml" xmlns:wps="http://schemas.microsoft.com/office/word/2010/wordprocessingShape" mc:Ignorable="w14 w15 w16se w16cid w16 w16cex w16sdtdh w16sdtfl w16du wp14">
+  <w:p>
+    <w:pPr>
+      <w:pStyle w:val="Header"/>
+      <w:rPr>
+        <w:rFonts w:asciiTheme="majorHAnsi" w:hAnsiTheme="majorHAnsi" w:cs="Calibri"/>
+        <w:b/>
+        <w:bCs/>
+        <w:color w:val="172554"/>
+        <w:sz w:val="56"/>
+        <w:szCs w:val="56"/>
+        <w:lang w:val="en-US"/>
+      </w:rPr>
+    </w:pPr>
   </w:p>
 </w:hdr>
 </file>
@@ -1496,4 +1936,16 @@
     </a:ext>
   </a:extLst>
 </a:theme>
+</file>
+
+<file path=customXml/item1.xml><?xml version="1.0" encoding="utf-8"?>
+<b:Sources xmlns:b="http://schemas.openxmlformats.org/officeDocument/2006/bibliography" xmlns="http://schemas.openxmlformats.org/officeDocument/2006/bibliography" SelectedStyle="\APASixthEditionOfficeOnline.xsl" StyleName="APA" Version="6"/>
+</file>
+
+<file path=customXml/itemProps1.xml><?xml version="1.0" encoding="utf-8"?>
+<ds:datastoreItem xmlns:ds="http://schemas.openxmlformats.org/officeDocument/2006/customXml" ds:itemID="{3A9110DE-B909-438A-AC78-B114972F5EF3}">
+  <ds:schemaRefs>
+    <ds:schemaRef ds:uri="http://schemas.openxmlformats.org/officeDocument/2006/bibliography"/>
+  </ds:schemaRefs>
+</ds:datastoreItem>
 </file>
</xml_diff>

<commit_message>
Migrate View Notes to MySQL with subject-filtered query
</commit_message>
<xml_diff>
--- a/_AI_STUDY_ASSISTANT_.docx
+++ b/_AI_STUDY_ASSISTANT_.docx
@@ -123,131 +123,6 @@
     </w:p>
     <w:p>
       <w:pPr>
-        <w:rPr>
-          <w:color w:val="1F2937"/>
-          <w:sz w:val="26"/>
-          <w:szCs w:val="26"/>
-        </w:rPr>
-        <w:sectPr>
-          <w:headerReference w:type="default" r:id="rId7"/>
-          <w:pgSz w:w="11906" w:h="16838" w:code="9"/>
-          <w:pgMar w:top="1077" w:right="1077" w:bottom="1077" w:left="1440" w:header="709" w:footer="709" w:gutter="0"/>
-          <w:pgBorders w:offsetFrom="page">
-            <w:top w:val="single" w:sz="4" w:space="24" w:color="auto"/>
-            <w:left w:val="single" w:sz="4" w:space="24" w:color="auto"/>
-            <w:bottom w:val="single" w:sz="4" w:space="24" w:color="auto"/>
-            <w:right w:val="single" w:sz="4" w:space="24" w:color="auto"/>
-          </w:pgBorders>
-          <w:cols w:space="708"/>
-          <w:docGrid w:linePitch="360"/>
-        </w:sectPr>
-      </w:pPr>
-    </w:p>
-    <w:p>
-      <w:pPr>
-        <w:spacing w:line="276" w:lineRule="auto"/>
-        <w:jc w:val="both"/>
-        <w:rPr>
-          <w:color w:val="1F2937"/>
-          <w:sz w:val="26"/>
-          <w:szCs w:val="26"/>
-        </w:rPr>
-      </w:pPr>
-    </w:p>
-    <w:p>
-      <w:pPr>
-        <w:spacing w:line="276" w:lineRule="auto"/>
-        <w:jc w:val="both"/>
-        <w:rPr>
-          <w:color w:val="1F2937"/>
-          <w:sz w:val="26"/>
-          <w:szCs w:val="26"/>
-        </w:rPr>
-      </w:pPr>
-      <w:r>
-        <w:rPr>
-          <w:color w:val="1F2937"/>
-          <w:sz w:val="26"/>
-          <w:szCs w:val="26"/>
-        </w:rPr>
-        <w:t>In today’s education system, students have access to a large amount of study material in the form of notes, PDFs, websites, videos, assignments, and online resources. Although these resources make learning easier, managing all of them properly can become difficult. Students often keep their study material in different folders, applications, notebooks, or websites. Because of this, finding the right material at the right time can take unnecessary effort. Along with studying the actual subject, students also have to spend time organizing their notes, remembering important topics, preparing for tests, and keeping track of their progress.</w:t>
-      </w:r>
-    </w:p>
-    <w:p>
-      <w:pPr>
-        <w:spacing w:line="276" w:lineRule="auto"/>
-        <w:jc w:val="both"/>
-        <w:rPr>
-          <w:color w:val="1F2937"/>
-          <w:sz w:val="26"/>
-          <w:szCs w:val="26"/>
-        </w:rPr>
-      </w:pPr>
-    </w:p>
-    <w:p>
-      <w:pPr>
-        <w:spacing w:line="276" w:lineRule="auto"/>
-        <w:jc w:val="both"/>
-        <w:rPr>
-          <w:color w:val="1F2937"/>
-          <w:sz w:val="26"/>
-          <w:szCs w:val="26"/>
-        </w:rPr>
-      </w:pPr>
-      <w:r>
-        <w:rPr>
-          <w:color w:val="1F2937"/>
-          <w:sz w:val="26"/>
-          <w:szCs w:val="26"/>
-        </w:rPr>
-        <w:t>The AI Study Assistant is proposed as a software system that aims to make the process of managing study material simpler and more organized. The basic idea of the project is to provide students with a single platform where they can organize their subjects and store their notes in a structured way. Instead of keeping information scattered across different places, a student can create subjects, add study material, save notes, and access them whenever required. This provides a simple foundation for developing a more advanced learning system in the future.</w:t>
-      </w:r>
-    </w:p>
-    <w:p>
-      <w:pPr>
-        <w:spacing w:line="276" w:lineRule="auto"/>
-        <w:jc w:val="both"/>
-        <w:rPr>
-          <w:color w:val="1F2937"/>
-          <w:sz w:val="26"/>
-          <w:szCs w:val="26"/>
-        </w:rPr>
-      </w:pPr>
-    </w:p>
-    <w:p>
-      <w:pPr>
-        <w:spacing w:line="276" w:lineRule="auto"/>
-        <w:jc w:val="both"/>
-        <w:rPr>
-          <w:color w:val="1F2937"/>
-          <w:sz w:val="26"/>
-          <w:szCs w:val="26"/>
-        </w:rPr>
-      </w:pPr>
-      <w:r>
-        <w:rPr>
-          <w:color w:val="1F2937"/>
-          <w:sz w:val="26"/>
-          <w:szCs w:val="26"/>
-        </w:rPr>
-        <w:t>The initial version of the project focuses mainly on the basic requirements of a student. A student can create and manage different subjects and store notes according to those subjects. The system can also allow saved information to be viewed when required. These features may appear simple, but they form an important base for a larger study-assistance system. Proper organization of study material is necessary before more advanced features such as automatic question generation, summaries, quizzes, and progress analysis can be added.</w:t>
-      </w:r>
-    </w:p>
-    <w:p>
-      <w:pPr>
-        <w:spacing w:line="276" w:lineRule="auto"/>
-        <w:jc w:val="both"/>
-        <w:rPr>
-          <w:color w:val="1F2937"/>
-          <w:sz w:val="26"/>
-          <w:szCs w:val="26"/>
-        </w:rPr>
-      </w:pPr>
-    </w:p>
-    <w:p>
-      <w:pPr>
-        <w:spacing w:line="276" w:lineRule="auto"/>
-        <w:jc w:val="both"/>
         <w:rPr>
           <w:color w:val="1F2937"/>
           <w:sz w:val="26"/>
@@ -267,123 +142,95 @@
           <w:docGrid w:linePitch="360"/>
         </w:sectPr>
       </w:pPr>
-      <w:r>
-        <w:rPr>
-          <w:color w:val="1F2937"/>
-          <w:sz w:val="26"/>
-          <w:szCs w:val="26"/>
-        </w:rPr>
-        <w:t>The project is also designed with future development in mind. As the system develops, Artificial Intelligence can be introduced to make the assistant more useful and interactive. Instead of only storing information, the system can eventually understand the student's study material and help the student learn from it. For example, AI-based features could be used to generate questions from notes, create short summaries of lengthy material, identify important topics, and provide study recommendations. Natural Language Processing (NLP) can also help the system</w:t>
-      </w:r>
-    </w:p>
-    <w:p>
-      <w:pPr>
-        <w:spacing w:line="276" w:lineRule="auto"/>
-        <w:jc w:val="both"/>
-        <w:rPr>
-          <w:color w:val="1F2937"/>
-          <w:sz w:val="26"/>
-          <w:szCs w:val="26"/>
-        </w:rPr>
-      </w:pPr>
-      <w:r>
-        <w:rPr>
-          <w:color w:val="1F2937"/>
-          <w:sz w:val="26"/>
-          <w:szCs w:val="26"/>
-        </w:rPr>
-        <w:lastRenderedPageBreak/>
-        <w:t xml:space="preserve"> understand questions written in normal human language and provide relevant responses.</w:t>
-      </w:r>
-    </w:p>
-    <w:p>
-      <w:pPr>
-        <w:spacing w:line="276" w:lineRule="auto"/>
-        <w:jc w:val="both"/>
-        <w:rPr>
-          <w:color w:val="1F2937"/>
-          <w:sz w:val="26"/>
-          <w:szCs w:val="26"/>
-        </w:rPr>
-      </w:pPr>
-    </w:p>
-    <w:p>
-      <w:pPr>
-        <w:spacing w:line="276" w:lineRule="auto"/>
-        <w:jc w:val="both"/>
-        <w:rPr>
-          <w:color w:val="1F2937"/>
-          <w:sz w:val="26"/>
-          <w:szCs w:val="26"/>
-        </w:rPr>
-      </w:pPr>
-      <w:r>
-        <w:rPr>
-          <w:color w:val="1F2937"/>
-          <w:sz w:val="26"/>
-          <w:szCs w:val="26"/>
-        </w:rPr>
-        <w:t>Another important aspect of the project is personalization. Every student has different subjects, study material, learning requirements, and areas where they need more practice. A future version of the AI Study Assistant can use the student's interaction with the system to provide more personalized assistance. For example, if a student frequently practices a particular topic or has difficulty with certain types of questions, the system could use this information to suggest relevant study material or additional practice. This can gradually transform the project from a simple storage system into a personalized digital learning companion.</w:t>
-      </w:r>
-    </w:p>
-    <w:p>
-      <w:pPr>
-        <w:spacing w:line="276" w:lineRule="auto"/>
-        <w:jc w:val="both"/>
-        <w:rPr>
-          <w:color w:val="1F2937"/>
-          <w:sz w:val="26"/>
-          <w:szCs w:val="26"/>
-        </w:rPr>
-      </w:pPr>
-    </w:p>
-    <w:p>
-      <w:pPr>
-        <w:spacing w:line="276" w:lineRule="auto"/>
-        <w:jc w:val="both"/>
-        <w:rPr>
-          <w:color w:val="1F2937"/>
-          <w:sz w:val="26"/>
-          <w:szCs w:val="26"/>
-        </w:rPr>
-      </w:pPr>
-      <w:r>
-        <w:rPr>
-          <w:color w:val="1F2937"/>
-          <w:sz w:val="26"/>
-          <w:szCs w:val="26"/>
-        </w:rPr>
-        <w:t>From a technical point of view, the project also provides an opportunity to understand how different technologies can be combined to create a useful application. The initial development can be carried out using Python, while a database such as MySQL can be used for storing structured information. As the project becomes more advanced, concepts related to Artificial Intelligence, Machine Learning, NLP, Large Language Models (LLMs), and Retrieval-Augmented Generation (RAG) can be explored and integrated where appropriate.</w:t>
-      </w:r>
-    </w:p>
-    <w:p>
-      <w:pPr>
-        <w:spacing w:line="276" w:lineRule="auto"/>
-        <w:jc w:val="both"/>
-        <w:rPr>
-          <w:color w:val="1F2937"/>
-          <w:sz w:val="26"/>
-          <w:szCs w:val="26"/>
-        </w:rPr>
-      </w:pPr>
-    </w:p>
-    <w:p>
-      <w:pPr>
-        <w:spacing w:line="276" w:lineRule="auto"/>
-        <w:jc w:val="both"/>
-        <w:rPr>
-          <w:color w:val="1F2937"/>
-          <w:sz w:val="26"/>
-          <w:szCs w:val="26"/>
-        </w:rPr>
-      </w:pPr>
-      <w:r>
-        <w:rPr>
-          <w:color w:val="1F2937"/>
-          <w:sz w:val="26"/>
-          <w:szCs w:val="26"/>
-        </w:rPr>
-        <w:t>The development of the project can therefore be viewed as a gradual process rather than trying to build a complete AI system at once. The basic version provides the essential functionality for managing study material, while future versions can introduce intelligent features step by step. This approach makes the project easier to understand, test, improve, and expand throughout the development process.</w:t>
+    </w:p>
+    <w:p>
+      <w:pPr>
+        <w:spacing w:line="276" w:lineRule="auto"/>
+        <w:jc w:val="both"/>
+        <w:rPr>
+          <w:color w:val="1F2937"/>
+          <w:sz w:val="26"/>
+          <w:szCs w:val="26"/>
+        </w:rPr>
+      </w:pPr>
+    </w:p>
+    <w:p>
+      <w:pPr>
+        <w:spacing w:line="276" w:lineRule="auto"/>
+        <w:jc w:val="both"/>
+        <w:rPr>
+          <w:color w:val="1F2937"/>
+          <w:sz w:val="26"/>
+          <w:szCs w:val="26"/>
+        </w:rPr>
+      </w:pPr>
+      <w:r>
+        <w:rPr>
+          <w:color w:val="1F2937"/>
+          <w:sz w:val="26"/>
+          <w:szCs w:val="26"/>
+        </w:rPr>
+        <w:t>In today’s education system, students have access to a large amount of study material in the form of notes, PDFs, websites, videos, assignments, and online resources. Although these resources make learning easier, managing all of them properly can become difficult. Students often keep their study material in different folders, applications, notebooks, or websites. Because of this, finding the right material at the right time can take unnecessary effort. Along with studying the actual subject, students also have to spend time organizing their notes, remembering important topics, preparing for tests, and keeping track of their progress.</w:t>
+      </w:r>
+    </w:p>
+    <w:p>
+      <w:pPr>
+        <w:spacing w:line="276" w:lineRule="auto"/>
+        <w:jc w:val="both"/>
+        <w:rPr>
+          <w:color w:val="1F2937"/>
+          <w:sz w:val="26"/>
+          <w:szCs w:val="26"/>
+        </w:rPr>
+      </w:pPr>
+    </w:p>
+    <w:p>
+      <w:pPr>
+        <w:spacing w:line="276" w:lineRule="auto"/>
+        <w:jc w:val="both"/>
+        <w:rPr>
+          <w:color w:val="1F2937"/>
+          <w:sz w:val="26"/>
+          <w:szCs w:val="26"/>
+        </w:rPr>
+      </w:pPr>
+      <w:r>
+        <w:rPr>
+          <w:color w:val="1F2937"/>
+          <w:sz w:val="26"/>
+          <w:szCs w:val="26"/>
+        </w:rPr>
+        <w:t>The AI Study Assistant is proposed as a software system that aims to make the process of managing study material simpler and more organized. The basic idea of the project is to provide students with a single platform where they can organize their subjects and store their notes in a structured way. Instead of keeping information scattered across different places, a student can create subjects, add study material, save notes, and access them whenever required. This provides a simple foundation for developing a more advanced learning system in the future.</w:t>
+      </w:r>
+    </w:p>
+    <w:p>
+      <w:pPr>
+        <w:spacing w:line="276" w:lineRule="auto"/>
+        <w:jc w:val="both"/>
+        <w:rPr>
+          <w:color w:val="1F2937"/>
+          <w:sz w:val="26"/>
+          <w:szCs w:val="26"/>
+        </w:rPr>
+      </w:pPr>
+    </w:p>
+    <w:p>
+      <w:pPr>
+        <w:spacing w:line="276" w:lineRule="auto"/>
+        <w:jc w:val="both"/>
+        <w:rPr>
+          <w:color w:val="1F2937"/>
+          <w:sz w:val="26"/>
+          <w:szCs w:val="26"/>
+        </w:rPr>
+      </w:pPr>
+      <w:r>
+        <w:rPr>
+          <w:color w:val="1F2937"/>
+          <w:sz w:val="26"/>
+          <w:szCs w:val="26"/>
+        </w:rPr>
+        <w:t>The initial version of the project focuses mainly on the basic requirements of a student. A student can create and manage different subjects and store notes according to those subjects. The system can also allow saved information to be viewed when required. These features may appear simple, but they form an important base for a larger study-assistance system. Proper organization of study material is necessary before more advanced features such as automatic question generation, summaries, quizzes, and progress analysis can be added.</w:t>
       </w:r>
     </w:p>
     <w:p>
@@ -426,6 +273,159 @@
           <w:sz w:val="26"/>
           <w:szCs w:val="26"/>
         </w:rPr>
+        <w:t>The project is also designed with future development in mind. As the system develops, Artificial Intelligence can be introduced to make the assistant more useful and interactive. Instead of only storing information, the system can eventually understand the student's study material and help the student learn from it. For example, AI-based features could be used to generate questions from notes, create short summaries of lengthy material, identify important topics, and provide study recommendations. Natural Language Processing (NLP) can also help the system</w:t>
+      </w:r>
+    </w:p>
+    <w:p>
+      <w:pPr>
+        <w:spacing w:line="276" w:lineRule="auto"/>
+        <w:jc w:val="both"/>
+        <w:rPr>
+          <w:color w:val="1F2937"/>
+          <w:sz w:val="26"/>
+          <w:szCs w:val="26"/>
+        </w:rPr>
+      </w:pPr>
+      <w:r>
+        <w:rPr>
+          <w:color w:val="1F2937"/>
+          <w:sz w:val="26"/>
+          <w:szCs w:val="26"/>
+        </w:rPr>
+        <w:lastRenderedPageBreak/>
+        <w:t xml:space="preserve"> understand questions written in normal human language and provide relevant responses.</w:t>
+      </w:r>
+    </w:p>
+    <w:p>
+      <w:pPr>
+        <w:spacing w:line="276" w:lineRule="auto"/>
+        <w:jc w:val="both"/>
+        <w:rPr>
+          <w:color w:val="1F2937"/>
+          <w:sz w:val="26"/>
+          <w:szCs w:val="26"/>
+        </w:rPr>
+      </w:pPr>
+    </w:p>
+    <w:p>
+      <w:pPr>
+        <w:spacing w:line="276" w:lineRule="auto"/>
+        <w:jc w:val="both"/>
+        <w:rPr>
+          <w:color w:val="1F2937"/>
+          <w:sz w:val="26"/>
+          <w:szCs w:val="26"/>
+        </w:rPr>
+      </w:pPr>
+      <w:r>
+        <w:rPr>
+          <w:color w:val="1F2937"/>
+          <w:sz w:val="26"/>
+          <w:szCs w:val="26"/>
+        </w:rPr>
+        <w:t>Another important aspect of the project is personalization. Every student has different subjects, study material, learning requirements, and areas where they need more practice. A future version of the AI Study Assistant can use the student's interaction with the system to provide more personalized assistance. For example, if a student frequently practices a particular topic or has difficulty with certain types of questions, the system could use this information to suggest relevant study material or additional practice. This can gradually transform the project from a simple storage system into a personalized digital learning companion.</w:t>
+      </w:r>
+    </w:p>
+    <w:p>
+      <w:pPr>
+        <w:spacing w:line="276" w:lineRule="auto"/>
+        <w:jc w:val="both"/>
+        <w:rPr>
+          <w:color w:val="1F2937"/>
+          <w:sz w:val="26"/>
+          <w:szCs w:val="26"/>
+        </w:rPr>
+      </w:pPr>
+    </w:p>
+    <w:p>
+      <w:pPr>
+        <w:spacing w:line="276" w:lineRule="auto"/>
+        <w:jc w:val="both"/>
+        <w:rPr>
+          <w:color w:val="1F2937"/>
+          <w:sz w:val="26"/>
+          <w:szCs w:val="26"/>
+        </w:rPr>
+      </w:pPr>
+      <w:r>
+        <w:rPr>
+          <w:color w:val="1F2937"/>
+          <w:sz w:val="26"/>
+          <w:szCs w:val="26"/>
+        </w:rPr>
+        <w:t>From a technical point of view, the project also provides an opportunity to understand how different technologies can be combined to create a useful application. The initial development can be carried out using Python, while a database such as MySQL can be used for storing structured information. As the project becomes more advanced, concepts related to Artificial Intelligence, Machine Learning, NLP, Large Language Models (LLMs), and Retrieval-Augmented Generation (RAG) can be explored and integrated where appropriate.</w:t>
+      </w:r>
+    </w:p>
+    <w:p>
+      <w:pPr>
+        <w:spacing w:line="276" w:lineRule="auto"/>
+        <w:jc w:val="both"/>
+        <w:rPr>
+          <w:color w:val="1F2937"/>
+          <w:sz w:val="26"/>
+          <w:szCs w:val="26"/>
+        </w:rPr>
+      </w:pPr>
+    </w:p>
+    <w:p>
+      <w:pPr>
+        <w:spacing w:line="276" w:lineRule="auto"/>
+        <w:jc w:val="both"/>
+        <w:rPr>
+          <w:color w:val="1F2937"/>
+          <w:sz w:val="26"/>
+          <w:szCs w:val="26"/>
+        </w:rPr>
+      </w:pPr>
+      <w:r>
+        <w:rPr>
+          <w:color w:val="1F2937"/>
+          <w:sz w:val="26"/>
+          <w:szCs w:val="26"/>
+        </w:rPr>
+        <w:t>The development of the project can therefore be viewed as a gradual process rather than trying to build a complete AI system at once. The basic version provides the essential functionality for managing study material, while future versions can introduce intelligent features step by step. This approach makes the project easier to understand, test, improve, and expand throughout the development process.</w:t>
+      </w:r>
+    </w:p>
+    <w:p>
+      <w:pPr>
+        <w:spacing w:line="276" w:lineRule="auto"/>
+        <w:jc w:val="both"/>
+        <w:rPr>
+          <w:color w:val="1F2937"/>
+          <w:sz w:val="26"/>
+          <w:szCs w:val="26"/>
+        </w:rPr>
+      </w:pPr>
+    </w:p>
+    <w:p>
+      <w:pPr>
+        <w:spacing w:line="276" w:lineRule="auto"/>
+        <w:jc w:val="both"/>
+        <w:rPr>
+          <w:color w:val="1F2937"/>
+          <w:sz w:val="26"/>
+          <w:szCs w:val="26"/>
+        </w:rPr>
+        <w:sectPr>
+          <w:headerReference w:type="default" r:id="rId10"/>
+          <w:pgSz w:w="11906" w:h="16838" w:code="9"/>
+          <w:pgMar w:top="1077" w:right="1077" w:bottom="1077" w:left="1440" w:header="709" w:footer="709" w:gutter="0"/>
+          <w:pgBorders w:offsetFrom="page">
+            <w:top w:val="single" w:sz="4" w:space="24" w:color="auto"/>
+            <w:left w:val="single" w:sz="4" w:space="24" w:color="auto"/>
+            <w:bottom w:val="single" w:sz="4" w:space="24" w:color="auto"/>
+            <w:right w:val="single" w:sz="4" w:space="24" w:color="auto"/>
+          </w:pgBorders>
+          <w:cols w:space="708"/>
+          <w:docGrid w:linePitch="360"/>
+        </w:sectPr>
+      </w:pPr>
+      <w:r>
+        <w:rPr>
+          <w:color w:val="1F2937"/>
+          <w:sz w:val="26"/>
+          <w:szCs w:val="26"/>
+        </w:rPr>
         <w:t>The main purpose of the AI Study Assistant is not simply to replace traditional methods of studying. Instead, it is intended to support students by reducing the effort required to organize information and by providing useful assistance during the learning process. A well-organized digital system can help students spend more time actually understanding their subjects instead of searching through different sources for their notes and study material</w:t>
       </w:r>
     </w:p>
@@ -469,18 +469,1302 @@
           <w:sz w:val="26"/>
           <w:szCs w:val="26"/>
         </w:rPr>
-      </w:pPr>
-      <w:r>
-        <w:rPr>
-          <w:color w:val="1F2937"/>
-          <w:sz w:val="26"/>
-          <w:szCs w:val="26"/>
-        </w:rPr>
-        <w:t>Overall, the AI Study Assistant is proposed as a student-oriented platform that begins with a simple problem—organizing study material—and gradually works towards a more intelligent solution. By combining structured data management with future AI capabilities, the project can provide a foundation for a personalized learning environment where students can store, access, understand, and practice their study material more effectively.</w:t>
+        <w:sectPr>
+          <w:headerReference w:type="default" r:id="rId11"/>
+          <w:pgSz w:w="11906" w:h="16838" w:code="9"/>
+          <w:pgMar w:top="1077" w:right="1077" w:bottom="1077" w:left="1440" w:header="709" w:footer="709" w:gutter="0"/>
+          <w:pgBorders w:offsetFrom="page">
+            <w:top w:val="single" w:sz="4" w:space="24" w:color="auto"/>
+            <w:left w:val="single" w:sz="4" w:space="24" w:color="auto"/>
+            <w:bottom w:val="single" w:sz="4" w:space="24" w:color="auto"/>
+            <w:right w:val="single" w:sz="4" w:space="24" w:color="auto"/>
+          </w:pgBorders>
+          <w:cols w:space="708"/>
+          <w:docGrid w:linePitch="360"/>
+        </w:sectPr>
+      </w:pPr>
+      <w:r>
+        <w:rPr>
+          <w:color w:val="1F2937"/>
+          <w:sz w:val="26"/>
+          <w:szCs w:val="26"/>
+        </w:rPr>
+        <w:t>Overall, the AI Study Assistant is proposed as a student-oriented platform that begins with a simple problem—organizing study material—and gradually works towards a more intelligent solution. By combining structured data management with future AI capabilities, the project can provide a foundation for a personalized learning environment where students can store, access, understand, and practice their study material more effectively</w:t>
+      </w:r>
+    </w:p>
+    <w:p>
+      <w:pPr>
+        <w:spacing w:line="276" w:lineRule="auto"/>
+        <w:jc w:val="both"/>
+        <w:rPr>
+          <w:color w:val="1F2937"/>
+          <w:sz w:val="26"/>
+          <w:szCs w:val="26"/>
+        </w:rPr>
+      </w:pPr>
+    </w:p>
+    <w:p>
+      <w:pPr>
+        <w:spacing w:line="276" w:lineRule="auto"/>
+        <w:jc w:val="both"/>
+        <w:rPr>
+          <w:color w:val="1F2937"/>
+          <w:sz w:val="26"/>
+          <w:szCs w:val="26"/>
+        </w:rPr>
+      </w:pPr>
+      <w:r>
+        <w:rPr>
+          <w:color w:val="1F2937"/>
+          <w:sz w:val="26"/>
+          <w:szCs w:val="26"/>
+        </w:rPr>
+        <w:t>Artificial Intelligence (AI) has become an important technology in the field of education. In recent years, various AI-based educational systems have been developed to help students learn, revise, and manage their academic activities more effectively. Traditional learning mainly depends on textbooks, classroom teaching, notes, and direct interaction with teachers. Although these methods are useful, students may still face difficulties in organizing study material, revising different subjects, and getting quick assistance when required.</w:t>
+      </w:r>
+    </w:p>
+    <w:p>
+      <w:pPr>
+        <w:spacing w:line="276" w:lineRule="auto"/>
+        <w:jc w:val="both"/>
+        <w:rPr>
+          <w:color w:val="1F2937"/>
+          <w:sz w:val="26"/>
+          <w:szCs w:val="26"/>
+        </w:rPr>
+      </w:pPr>
+    </w:p>
+    <w:p>
+      <w:pPr>
+        <w:spacing w:line="276" w:lineRule="auto"/>
+        <w:jc w:val="both"/>
+        <w:rPr>
+          <w:color w:val="1F2937"/>
+          <w:sz w:val="26"/>
+          <w:szCs w:val="26"/>
+        </w:rPr>
+      </w:pPr>
+      <w:r>
+        <w:rPr>
+          <w:color w:val="1F2937"/>
+          <w:sz w:val="26"/>
+          <w:szCs w:val="26"/>
+        </w:rPr>
+        <w:t>One major area of research is Intelligent Tutoring Systems (ITS). These systems use computer-based techniques to provide students with guidance, explanations, questions, and feedback. Intelligent tutoring systems can support personalized learning by allowing students to learn according to their own pace and requirements. However, many existing systems are designed for specific subjects or require advanced AI models and large amounts of data.</w:t>
+      </w:r>
+    </w:p>
+    <w:p>
+      <w:pPr>
+        <w:spacing w:line="276" w:lineRule="auto"/>
+        <w:jc w:val="both"/>
+        <w:rPr>
+          <w:color w:val="1F2937"/>
+          <w:sz w:val="26"/>
+          <w:szCs w:val="26"/>
+        </w:rPr>
+      </w:pPr>
+    </w:p>
+    <w:p>
+      <w:pPr>
+        <w:spacing w:line="276" w:lineRule="auto"/>
+        <w:jc w:val="both"/>
+        <w:rPr>
+          <w:color w:val="1F2937"/>
+          <w:sz w:val="26"/>
+          <w:szCs w:val="26"/>
+        </w:rPr>
+      </w:pPr>
+      <w:r>
+        <w:rPr>
+          <w:color w:val="1F2937"/>
+          <w:sz w:val="26"/>
+          <w:szCs w:val="26"/>
+        </w:rPr>
+        <w:t>Another important development is the use of Natural Language Processing (NLP) and conversational AI in education. NLP allows computers to understand and process human language. Modern AI systems can answer questions, explain concepts, summarize information, and interact with users in a conversational manner. These capabilities can be useful in developing an AI-based study assistant that students can use for academic support.</w:t>
+      </w:r>
+    </w:p>
+    <w:p>
+      <w:pPr>
+        <w:spacing w:line="276" w:lineRule="auto"/>
+        <w:jc w:val="both"/>
+        <w:rPr>
+          <w:color w:val="1F2937"/>
+          <w:sz w:val="26"/>
+          <w:szCs w:val="26"/>
+        </w:rPr>
+      </w:pPr>
+    </w:p>
+    <w:p>
+      <w:pPr>
+        <w:spacing w:line="276" w:lineRule="auto"/>
+        <w:jc w:val="both"/>
+        <w:rPr>
+          <w:color w:val="1F2937"/>
+          <w:sz w:val="26"/>
+          <w:szCs w:val="26"/>
+        </w:rPr>
+      </w:pPr>
+      <w:r>
+        <w:rPr>
+          <w:color w:val="1F2937"/>
+          <w:sz w:val="26"/>
+          <w:szCs w:val="26"/>
+        </w:rPr>
+        <w:t>Digital note-management applications are also widely used by students for storing and organizing study material. However, traditional note-taking applications mainly provide storage and editing facilities and do not provide intelligent assistance. Combining note management with AI can create a more useful platform where students can organize their subjects and notes while also receiving intelligent support in future versions.</w:t>
+      </w:r>
+    </w:p>
+    <w:p>
+      <w:pPr>
+        <w:spacing w:line="276" w:lineRule="auto"/>
+        <w:jc w:val="both"/>
+        <w:rPr>
+          <w:color w:val="1F2937"/>
+          <w:sz w:val="26"/>
+          <w:szCs w:val="26"/>
+        </w:rPr>
+      </w:pPr>
+    </w:p>
+    <w:p>
+      <w:pPr>
+        <w:spacing w:line="276" w:lineRule="auto"/>
+        <w:jc w:val="both"/>
+        <w:rPr>
+          <w:color w:val="1F2937"/>
+          <w:sz w:val="26"/>
+          <w:szCs w:val="26"/>
+        </w:rPr>
+        <w:sectPr>
+          <w:headerReference w:type="default" r:id="rId12"/>
+          <w:pgSz w:w="11906" w:h="16838" w:code="9"/>
+          <w:pgMar w:top="1077" w:right="1077" w:bottom="1077" w:left="1440" w:header="709" w:footer="709" w:gutter="0"/>
+          <w:pgBorders w:offsetFrom="page">
+            <w:top w:val="single" w:sz="4" w:space="24" w:color="auto"/>
+            <w:left w:val="single" w:sz="4" w:space="24" w:color="auto"/>
+            <w:bottom w:val="single" w:sz="4" w:space="24" w:color="auto"/>
+            <w:right w:val="single" w:sz="4" w:space="24" w:color="auto"/>
+          </w:pgBorders>
+          <w:cols w:space="708"/>
+          <w:docGrid w:linePitch="360"/>
+        </w:sectPr>
+      </w:pPr>
+      <w:r>
+        <w:rPr>
+          <w:color w:val="1F2937"/>
+          <w:sz w:val="26"/>
+          <w:szCs w:val="26"/>
+        </w:rPr>
+        <w:t xml:space="preserve">Database technology is another important part of such systems. Relational databases such as MySQL provide structured and reliable storage for information. They allow data to be organized into tables and connected using relationships. In the </w:t>
+      </w:r>
+    </w:p>
+    <w:p>
+      <w:pPr>
+        <w:spacing w:line="276" w:lineRule="auto"/>
+        <w:jc w:val="both"/>
+        <w:rPr>
+          <w:color w:val="1F2937"/>
+          <w:sz w:val="26"/>
+          <w:szCs w:val="26"/>
+        </w:rPr>
+      </w:pPr>
+      <w:r>
+        <w:rPr>
+          <w:color w:val="1F2937"/>
+          <w:sz w:val="26"/>
+          <w:szCs w:val="26"/>
+        </w:rPr>
+        <w:lastRenderedPageBreak/>
+        <w:t>proposed AI Study Assistant, MySQL is being used to provide a better foundation for managing subjects and notes compared with simple file-based storage such as JSON.</w:t>
+      </w:r>
+    </w:p>
+    <w:p>
+      <w:pPr>
+        <w:spacing w:line="276" w:lineRule="auto"/>
+        <w:jc w:val="both"/>
+        <w:rPr>
+          <w:color w:val="1F2937"/>
+          <w:sz w:val="26"/>
+          <w:szCs w:val="26"/>
+        </w:rPr>
+      </w:pPr>
+    </w:p>
+    <w:p>
+      <w:pPr>
+        <w:spacing w:line="276" w:lineRule="auto"/>
+        <w:jc w:val="both"/>
+        <w:rPr>
+          <w:color w:val="1F2937"/>
+          <w:sz w:val="26"/>
+          <w:szCs w:val="26"/>
+        </w:rPr>
+        <w:sectPr>
+          <w:headerReference w:type="default" r:id="rId13"/>
+          <w:type w:val="continuous"/>
+          <w:pgSz w:w="11906" w:h="16838" w:code="9"/>
+          <w:pgMar w:top="1077" w:right="1077" w:bottom="1077" w:left="1440" w:header="709" w:footer="709" w:gutter="0"/>
+          <w:pgBorders w:offsetFrom="page">
+            <w:top w:val="single" w:sz="4" w:space="24" w:color="auto"/>
+            <w:left w:val="single" w:sz="4" w:space="24" w:color="auto"/>
+            <w:bottom w:val="single" w:sz="4" w:space="24" w:color="auto"/>
+            <w:right w:val="single" w:sz="4" w:space="24" w:color="auto"/>
+          </w:pgBorders>
+          <w:cols w:space="708"/>
+          <w:docGrid w:linePitch="360"/>
+        </w:sectPr>
+      </w:pPr>
+      <w:r>
+        <w:rPr>
+          <w:color w:val="1F2937"/>
+          <w:sz w:val="26"/>
+          <w:szCs w:val="26"/>
+        </w:rPr>
+        <w:t xml:space="preserve">Based on the study of existing technologies, the proposed AI Study Assistant aims to combine academic organization with future AI-based features in a simple and student-friendly system. The current Version 1.0 focuses on basic subject and </w:t>
+      </w:r>
+      <w:proofErr w:type="gramStart"/>
+      <w:r>
+        <w:rPr>
+          <w:color w:val="1F2937"/>
+          <w:sz w:val="26"/>
+          <w:szCs w:val="26"/>
+        </w:rPr>
+        <w:t>note</w:t>
+      </w:r>
+      <w:proofErr w:type="gramEnd"/>
+      <w:r>
+        <w:rPr>
+          <w:color w:val="1F2937"/>
+          <w:sz w:val="26"/>
+          <w:szCs w:val="26"/>
+        </w:rPr>
+        <w:t xml:space="preserve"> management and structured database storage. Future versions can introduce features such as AI-based question answering, note summarization, study recommendations, quiz generation, and personalized learning support. Thus, the project provides a foundation for developing a more intelligent and useful academic assistant.</w:t>
+      </w:r>
+    </w:p>
+    <w:p>
+      <w:pPr>
+        <w:spacing w:line="276" w:lineRule="auto"/>
+        <w:jc w:val="both"/>
+        <w:rPr>
+          <w:color w:val="1F2937"/>
+          <w:sz w:val="26"/>
+          <w:szCs w:val="26"/>
+        </w:rPr>
+      </w:pPr>
+    </w:p>
+    <w:p>
+      <w:pPr>
+        <w:rPr>
+          <w:color w:val="1F2937"/>
+          <w:sz w:val="26"/>
+          <w:szCs w:val="26"/>
+        </w:rPr>
+      </w:pPr>
+      <w:r>
+        <w:rPr>
+          <w:color w:val="1F2937"/>
+          <w:sz w:val="26"/>
+          <w:szCs w:val="26"/>
+        </w:rPr>
+        <w:br w:type="page"/>
+      </w:r>
+    </w:p>
+    <w:p>
+      <w:pPr>
+        <w:pStyle w:val="ListParagraph"/>
+        <w:spacing w:line="276" w:lineRule="auto"/>
+        <w:jc w:val="both"/>
+        <w:rPr>
+          <w:color w:val="1F2937"/>
+          <w:sz w:val="26"/>
+          <w:szCs w:val="26"/>
+        </w:rPr>
+      </w:pPr>
+    </w:p>
+    <w:p>
+      <w:pPr>
+        <w:pStyle w:val="ListParagraph"/>
+        <w:numPr>
+          <w:ilvl w:val="0"/>
+          <w:numId w:val="1"/>
+        </w:numPr>
+        <w:spacing w:line="276" w:lineRule="auto"/>
+        <w:jc w:val="both"/>
+        <w:rPr>
+          <w:color w:val="1F2937"/>
+          <w:sz w:val="26"/>
+          <w:szCs w:val="26"/>
+        </w:rPr>
+      </w:pPr>
+      <w:r>
+        <w:rPr>
+          <w:color w:val="1F2937"/>
+          <w:sz w:val="26"/>
+          <w:szCs w:val="26"/>
+        </w:rPr>
+        <w:t>To develop a centralized system for managing academic subjects and study notes.</w:t>
+      </w:r>
+    </w:p>
+    <w:p>
+      <w:pPr>
+        <w:pStyle w:val="ListParagraph"/>
+        <w:spacing w:line="276" w:lineRule="auto"/>
+        <w:jc w:val="both"/>
+        <w:rPr>
+          <w:color w:val="1F2937"/>
+          <w:sz w:val="26"/>
+          <w:szCs w:val="26"/>
+        </w:rPr>
+      </w:pPr>
+    </w:p>
+    <w:p>
+      <w:pPr>
+        <w:pStyle w:val="ListParagraph"/>
+        <w:numPr>
+          <w:ilvl w:val="0"/>
+          <w:numId w:val="1"/>
+        </w:numPr>
+        <w:spacing w:line="276" w:lineRule="auto"/>
+        <w:jc w:val="both"/>
+        <w:rPr>
+          <w:color w:val="1F2937"/>
+          <w:sz w:val="26"/>
+          <w:szCs w:val="26"/>
+        </w:rPr>
+      </w:pPr>
+      <w:r>
+        <w:rPr>
+          <w:color w:val="1F2937"/>
+          <w:sz w:val="26"/>
+          <w:szCs w:val="26"/>
+        </w:rPr>
+        <w:t xml:space="preserve">To implement </w:t>
+      </w:r>
+      <w:proofErr w:type="gramStart"/>
+      <w:r>
+        <w:rPr>
+          <w:color w:val="1F2937"/>
+          <w:sz w:val="26"/>
+          <w:szCs w:val="26"/>
+        </w:rPr>
+        <w:t>basic</w:t>
+      </w:r>
+      <w:proofErr w:type="gramEnd"/>
+      <w:r>
+        <w:rPr>
+          <w:color w:val="1F2937"/>
+          <w:sz w:val="26"/>
+          <w:szCs w:val="26"/>
+        </w:rPr>
+        <w:t xml:space="preserve"> Create, Read, Update, and Delete (CRUD) operations.</w:t>
+      </w:r>
+    </w:p>
+    <w:p>
+      <w:pPr>
+        <w:pStyle w:val="ListParagraph"/>
+        <w:rPr>
+          <w:color w:val="1F2937"/>
+          <w:sz w:val="26"/>
+          <w:szCs w:val="26"/>
+        </w:rPr>
+      </w:pPr>
+    </w:p>
+    <w:p>
+      <w:pPr>
+        <w:pStyle w:val="ListParagraph"/>
+        <w:spacing w:line="276" w:lineRule="auto"/>
+        <w:jc w:val="both"/>
+        <w:rPr>
+          <w:color w:val="1F2937"/>
+          <w:sz w:val="26"/>
+          <w:szCs w:val="26"/>
+        </w:rPr>
+      </w:pPr>
+    </w:p>
+    <w:p>
+      <w:pPr>
+        <w:pStyle w:val="ListParagraph"/>
+        <w:numPr>
+          <w:ilvl w:val="0"/>
+          <w:numId w:val="1"/>
+        </w:numPr>
+        <w:spacing w:line="276" w:lineRule="auto"/>
+        <w:jc w:val="both"/>
+        <w:rPr>
+          <w:color w:val="1F2937"/>
+          <w:sz w:val="26"/>
+          <w:szCs w:val="26"/>
+        </w:rPr>
+      </w:pPr>
+      <w:r>
+        <w:rPr>
+          <w:color w:val="1F2937"/>
+          <w:sz w:val="26"/>
+          <w:szCs w:val="26"/>
+        </w:rPr>
+        <w:t>To integrate a Python application with a MySQL database.</w:t>
+      </w:r>
+    </w:p>
+    <w:p>
+      <w:pPr>
+        <w:pStyle w:val="ListParagraph"/>
+        <w:spacing w:line="276" w:lineRule="auto"/>
+        <w:jc w:val="both"/>
+        <w:rPr>
+          <w:color w:val="1F2937"/>
+          <w:sz w:val="26"/>
+          <w:szCs w:val="26"/>
+        </w:rPr>
+      </w:pPr>
+    </w:p>
+    <w:p>
+      <w:pPr>
+        <w:pStyle w:val="ListParagraph"/>
+        <w:numPr>
+          <w:ilvl w:val="0"/>
+          <w:numId w:val="1"/>
+        </w:numPr>
+        <w:spacing w:line="276" w:lineRule="auto"/>
+        <w:jc w:val="both"/>
+        <w:rPr>
+          <w:color w:val="1F2937"/>
+          <w:sz w:val="26"/>
+          <w:szCs w:val="26"/>
+        </w:rPr>
+      </w:pPr>
+      <w:r>
+        <w:rPr>
+          <w:color w:val="1F2937"/>
+          <w:sz w:val="26"/>
+          <w:szCs w:val="26"/>
+        </w:rPr>
+        <w:t>To progressively improve the system through clearly defined development versions.</w:t>
+      </w:r>
+    </w:p>
+    <w:p>
+      <w:pPr>
+        <w:pStyle w:val="ListParagraph"/>
+        <w:rPr>
+          <w:color w:val="1F2937"/>
+          <w:sz w:val="26"/>
+          <w:szCs w:val="26"/>
+        </w:rPr>
+      </w:pPr>
+    </w:p>
+    <w:p>
+      <w:pPr>
+        <w:pStyle w:val="ListParagraph"/>
+        <w:spacing w:line="276" w:lineRule="auto"/>
+        <w:jc w:val="both"/>
+        <w:rPr>
+          <w:color w:val="1F2937"/>
+          <w:sz w:val="26"/>
+          <w:szCs w:val="26"/>
+        </w:rPr>
+      </w:pPr>
+    </w:p>
+    <w:p>
+      <w:pPr>
+        <w:pStyle w:val="ListParagraph"/>
+        <w:numPr>
+          <w:ilvl w:val="0"/>
+          <w:numId w:val="1"/>
+        </w:numPr>
+        <w:spacing w:line="276" w:lineRule="auto"/>
+        <w:jc w:val="both"/>
+        <w:rPr>
+          <w:color w:val="1F2937"/>
+          <w:sz w:val="26"/>
+          <w:szCs w:val="26"/>
+        </w:rPr>
+      </w:pPr>
+      <w:r>
+        <w:rPr>
+          <w:color w:val="1F2937"/>
+          <w:sz w:val="26"/>
+          <w:szCs w:val="26"/>
+        </w:rPr>
+        <w:t>To provide quizzes as part of the planned Version 1.0 study-management system.</w:t>
+      </w:r>
+    </w:p>
+    <w:p>
+      <w:pPr>
+        <w:pStyle w:val="ListParagraph"/>
+        <w:spacing w:line="276" w:lineRule="auto"/>
+        <w:jc w:val="both"/>
+        <w:rPr>
+          <w:color w:val="1F2937"/>
+          <w:sz w:val="26"/>
+          <w:szCs w:val="26"/>
+        </w:rPr>
+      </w:pPr>
+    </w:p>
+    <w:p>
+      <w:pPr>
+        <w:pStyle w:val="ListParagraph"/>
+        <w:numPr>
+          <w:ilvl w:val="0"/>
+          <w:numId w:val="1"/>
+        </w:numPr>
+        <w:spacing w:line="276" w:lineRule="auto"/>
+        <w:jc w:val="both"/>
+        <w:rPr>
+          <w:color w:val="1F2937"/>
+          <w:sz w:val="26"/>
+          <w:szCs w:val="26"/>
+        </w:rPr>
+      </w:pPr>
+      <w:r>
+        <w:rPr>
+          <w:color w:val="1F2937"/>
+          <w:sz w:val="26"/>
+          <w:szCs w:val="26"/>
+        </w:rPr>
+        <w:t>To provide progress tracking in the planned Version 1.0 system.</w:t>
+      </w:r>
+    </w:p>
+    <w:p>
+      <w:pPr>
+        <w:pStyle w:val="ListParagraph"/>
+        <w:rPr>
+          <w:color w:val="1F2937"/>
+          <w:sz w:val="26"/>
+          <w:szCs w:val="26"/>
+        </w:rPr>
+      </w:pPr>
+    </w:p>
+    <w:p>
+      <w:pPr>
+        <w:pStyle w:val="ListParagraph"/>
+        <w:spacing w:line="276" w:lineRule="auto"/>
+        <w:jc w:val="both"/>
+        <w:rPr>
+          <w:color w:val="1F2937"/>
+          <w:sz w:val="26"/>
+          <w:szCs w:val="26"/>
+        </w:rPr>
+      </w:pPr>
+    </w:p>
+    <w:p>
+      <w:pPr>
+        <w:pStyle w:val="ListParagraph"/>
+        <w:numPr>
+          <w:ilvl w:val="0"/>
+          <w:numId w:val="1"/>
+        </w:numPr>
+        <w:spacing w:line="276" w:lineRule="auto"/>
+        <w:jc w:val="both"/>
+        <w:rPr>
+          <w:color w:val="1F2937"/>
+          <w:sz w:val="26"/>
+          <w:szCs w:val="26"/>
+        </w:rPr>
+        <w:sectPr>
+          <w:headerReference w:type="default" r:id="rId14"/>
+          <w:type w:val="continuous"/>
+          <w:pgSz w:w="11906" w:h="16838" w:code="9"/>
+          <w:pgMar w:top="1077" w:right="1077" w:bottom="1077" w:left="1440" w:header="709" w:footer="709" w:gutter="0"/>
+          <w:pgBorders w:offsetFrom="page">
+            <w:top w:val="single" w:sz="4" w:space="24" w:color="auto"/>
+            <w:left w:val="single" w:sz="4" w:space="24" w:color="auto"/>
+            <w:bottom w:val="single" w:sz="4" w:space="24" w:color="auto"/>
+            <w:right w:val="single" w:sz="4" w:space="24" w:color="auto"/>
+          </w:pgBorders>
+          <w:cols w:space="708"/>
+          <w:docGrid w:linePitch="360"/>
+        </w:sectPr>
+      </w:pPr>
+      <w:r>
+        <w:rPr>
+          <w:color w:val="1F2937"/>
+          <w:sz w:val="26"/>
+          <w:szCs w:val="26"/>
+        </w:rPr>
+        <w:t>To create a foundation for future AI-based educational features.</w:t>
+      </w:r>
+    </w:p>
+    <w:p>
+      <w:pPr>
+        <w:pStyle w:val="ListParagraph"/>
+        <w:spacing w:line="276" w:lineRule="auto"/>
+        <w:jc w:val="both"/>
+        <w:rPr>
+          <w:color w:val="1F2937"/>
+          <w:sz w:val="26"/>
+          <w:szCs w:val="26"/>
+        </w:rPr>
+        <w:sectPr>
+          <w:type w:val="continuous"/>
+          <w:pgSz w:w="11906" w:h="16838" w:code="9"/>
+          <w:pgMar w:top="1077" w:right="1077" w:bottom="1077" w:left="1440" w:header="709" w:footer="709" w:gutter="0"/>
+          <w:pgBorders w:offsetFrom="page">
+            <w:top w:val="single" w:sz="4" w:space="24" w:color="auto"/>
+            <w:left w:val="single" w:sz="4" w:space="24" w:color="auto"/>
+            <w:bottom w:val="single" w:sz="4" w:space="24" w:color="auto"/>
+            <w:right w:val="single" w:sz="4" w:space="24" w:color="auto"/>
+          </w:pgBorders>
+          <w:cols w:space="708"/>
+          <w:docGrid w:linePitch="360"/>
+        </w:sectPr>
+      </w:pPr>
+    </w:p>
+    <w:p>
+      <w:pPr>
+        <w:pStyle w:val="ListParagraph"/>
+        <w:spacing w:line="276" w:lineRule="auto"/>
+        <w:jc w:val="both"/>
+        <w:rPr>
+          <w:color w:val="1F2937"/>
+          <w:sz w:val="26"/>
+          <w:szCs w:val="26"/>
+        </w:rPr>
+      </w:pPr>
+    </w:p>
+    <w:p>
+      <w:pPr>
+        <w:spacing w:line="276" w:lineRule="auto"/>
+        <w:jc w:val="both"/>
+        <w:rPr>
+          <w:color w:val="1F2937"/>
+          <w:sz w:val="26"/>
+          <w:szCs w:val="26"/>
+        </w:rPr>
+      </w:pPr>
+      <w:r>
+        <w:rPr>
+          <w:color w:val="1F2937"/>
+          <w:sz w:val="26"/>
+          <w:szCs w:val="26"/>
+        </w:rPr>
+        <w:t>The proposed project is based on the hypothesis that an AI Study Assistant can help students manage their academic information more efficiently and provide a foundation for personalized learning support. By combining subject management, note management, structured database storage, and future AI-based features into a single system, students can organize their study material in a more systematic manner.</w:t>
+      </w:r>
+    </w:p>
+    <w:p>
+      <w:pPr>
+        <w:spacing w:line="276" w:lineRule="auto"/>
+        <w:jc w:val="both"/>
+        <w:rPr>
+          <w:color w:val="1F2937"/>
+          <w:sz w:val="26"/>
+          <w:szCs w:val="26"/>
+        </w:rPr>
+      </w:pPr>
+      <w:r>
+        <w:rPr>
+          <w:color w:val="1F2937"/>
+          <w:sz w:val="26"/>
+          <w:szCs w:val="26"/>
+        </w:rPr>
+        <w:t>The project assumes that a digital system for managing subjects and notes can reduce the difficulty of maintaining academic information manually. Storing information in a structured database such as MySQL can make it easier to add, view, edit, delete, and retrieve academic data. This can provide a more organized approach compared with maintaining study information in separate files or notebooks.</w:t>
+      </w:r>
+    </w:p>
+    <w:p>
+      <w:pPr>
+        <w:spacing w:line="276" w:lineRule="auto"/>
+        <w:jc w:val="both"/>
+        <w:rPr>
+          <w:color w:val="1F2937"/>
+          <w:sz w:val="26"/>
+          <w:szCs w:val="26"/>
+        </w:rPr>
+      </w:pPr>
+      <w:r>
+        <w:rPr>
+          <w:color w:val="1F2937"/>
+          <w:sz w:val="26"/>
+          <w:szCs w:val="26"/>
+        </w:rPr>
+        <w:t>It is further hypothesized that the future integration of Artificial Intelligence can make the system more useful than a conventional note-management application. AI-based features such as question answering, concept explanation, note summarization, quiz generation, and study recommendations could provide students with additional academic support and help them understand and revise their subjects more effectively.</w:t>
+      </w:r>
+    </w:p>
+    <w:p>
+      <w:pPr>
+        <w:spacing w:line="276" w:lineRule="auto"/>
+        <w:jc w:val="both"/>
+        <w:rPr>
+          <w:color w:val="1F2937"/>
+          <w:sz w:val="26"/>
+          <w:szCs w:val="26"/>
+        </w:rPr>
+      </w:pPr>
+      <w:r>
+        <w:rPr>
+          <w:color w:val="1F2937"/>
+          <w:sz w:val="26"/>
+          <w:szCs w:val="26"/>
+        </w:rPr>
+        <w:t>The hypothesis of the project can therefore be stated as follows:</w:t>
+      </w:r>
+    </w:p>
+    <w:p>
+      <w:pPr>
+        <w:spacing w:line="276" w:lineRule="auto"/>
+        <w:jc w:val="both"/>
+        <w:rPr>
+          <w:color w:val="1F2937"/>
+          <w:sz w:val="26"/>
+          <w:szCs w:val="26"/>
+        </w:rPr>
+      </w:pPr>
+      <w:r>
+        <w:rPr>
+          <w:color w:val="1F2937"/>
+          <w:sz w:val="26"/>
+          <w:szCs w:val="26"/>
+        </w:rPr>
+        <w:t>“If a student is provided with a simple and organized study assistant that combines academic data management with AI-based assistance, then the student will be able to manage study material more efficiently and receive better support for learning and revision.”</w:t>
+      </w:r>
+    </w:p>
+    <w:p>
+      <w:pPr>
+        <w:spacing w:line="276" w:lineRule="auto"/>
+        <w:jc w:val="both"/>
+        <w:rPr>
+          <w:color w:val="1F2937"/>
+          <w:sz w:val="26"/>
+          <w:szCs w:val="26"/>
+        </w:rPr>
+        <w:sectPr>
+          <w:headerReference w:type="default" r:id="rId15"/>
+          <w:pgSz w:w="11906" w:h="16838" w:code="9"/>
+          <w:pgMar w:top="1077" w:right="1077" w:bottom="1077" w:left="1440" w:header="709" w:footer="709" w:gutter="0"/>
+          <w:pgBorders w:offsetFrom="page">
+            <w:top w:val="single" w:sz="4" w:space="24" w:color="auto"/>
+            <w:left w:val="single" w:sz="4" w:space="24" w:color="auto"/>
+            <w:bottom w:val="single" w:sz="4" w:space="24" w:color="auto"/>
+            <w:right w:val="single" w:sz="4" w:space="24" w:color="auto"/>
+          </w:pgBorders>
+          <w:cols w:space="708"/>
+          <w:docGrid w:linePitch="360"/>
+        </w:sectPr>
+      </w:pPr>
+      <w:r>
+        <w:rPr>
+          <w:color w:val="1F2937"/>
+          <w:sz w:val="26"/>
+          <w:szCs w:val="26"/>
+        </w:rPr>
+        <w:t>In Version 1.0, the project mainly tests the basic part of this hypothesis by implementing subject and note management along with database-based storage. The effectiveness of advanced AI features will be evaluated in future versions as they are gradually added to the system.</w:t>
+      </w:r>
+    </w:p>
+    <w:p>
+      <w:pPr>
+        <w:spacing w:line="276" w:lineRule="auto"/>
+        <w:jc w:val="both"/>
+        <w:rPr>
+          <w:color w:val="1F2937"/>
+          <w:sz w:val="26"/>
+          <w:szCs w:val="26"/>
+        </w:rPr>
+      </w:pPr>
+    </w:p>
+    <w:p>
+      <w:pPr>
+        <w:spacing w:line="276" w:lineRule="auto"/>
+        <w:jc w:val="both"/>
+        <w:rPr>
+          <w:color w:val="1F2937"/>
+          <w:sz w:val="26"/>
+          <w:szCs w:val="26"/>
+        </w:rPr>
+      </w:pPr>
+      <w:r>
+        <w:rPr>
+          <w:color w:val="1F2937"/>
+          <w:sz w:val="26"/>
+          <w:szCs w:val="26"/>
+        </w:rPr>
+        <w:t>The development of the AI Study Assistant follows a step-by-step approach in which the basic academic management system is developed first and advanced AI features are planned for future versions. The methodology focuses on creating a simple, reliable, and expandable system that can manage students' subjects and study notes.</w:t>
+      </w:r>
+    </w:p>
+    <w:p>
+      <w:pPr>
+        <w:spacing w:line="276" w:lineRule="auto"/>
+        <w:jc w:val="both"/>
+        <w:rPr>
+          <w:color w:val="1F2937"/>
+          <w:sz w:val="26"/>
+          <w:szCs w:val="26"/>
+        </w:rPr>
+      </w:pPr>
+    </w:p>
+    <w:p>
+      <w:pPr>
+        <w:spacing w:line="276" w:lineRule="auto"/>
+        <w:jc w:val="both"/>
+        <w:rPr>
+          <w:color w:val="1F2937"/>
+          <w:sz w:val="26"/>
+          <w:szCs w:val="26"/>
+        </w:rPr>
+      </w:pPr>
+      <w:r>
+        <w:rPr>
+          <w:color w:val="1F2937"/>
+          <w:sz w:val="26"/>
+          <w:szCs w:val="26"/>
+        </w:rPr>
+        <w:t>The first step is requirement identification. The basic requirements of the system are identified based on the common needs of students. These include adding subjects, viewing subjects, editing subjects, deleting subjects, adding notes, viewing notes, editing notes, and deleting notes. These functions form the basic structure of Version 1.0.</w:t>
+      </w:r>
+    </w:p>
+    <w:p>
+      <w:pPr>
+        <w:spacing w:line="276" w:lineRule="auto"/>
+        <w:jc w:val="both"/>
+        <w:rPr>
+          <w:color w:val="1F2937"/>
+          <w:sz w:val="26"/>
+          <w:szCs w:val="26"/>
+        </w:rPr>
+      </w:pPr>
+    </w:p>
+    <w:p>
+      <w:pPr>
+        <w:spacing w:line="276" w:lineRule="auto"/>
+        <w:jc w:val="both"/>
+        <w:rPr>
+          <w:color w:val="1F2937"/>
+          <w:sz w:val="26"/>
+          <w:szCs w:val="26"/>
+        </w:rPr>
+      </w:pPr>
+      <w:r>
+        <w:rPr>
+          <w:color w:val="1F2937"/>
+          <w:sz w:val="26"/>
+          <w:szCs w:val="26"/>
+        </w:rPr>
+        <w:t xml:space="preserve">The second step is system design and data organization. The information required by the application is </w:t>
+      </w:r>
+      <w:proofErr w:type="spellStart"/>
+      <w:r>
+        <w:rPr>
+          <w:color w:val="1F2937"/>
+          <w:sz w:val="26"/>
+          <w:szCs w:val="26"/>
+        </w:rPr>
+        <w:t>analyzed</w:t>
+      </w:r>
+      <w:proofErr w:type="spellEnd"/>
+      <w:r>
+        <w:rPr>
+          <w:color w:val="1F2937"/>
+          <w:sz w:val="26"/>
+          <w:szCs w:val="26"/>
+        </w:rPr>
+        <w:t xml:space="preserve"> and organized into suitable data structures. Initially, JSON-based storage was used for handling data during the early development stage. As the project developed, the storage system was gradually shifted toward MySQL to provide structured and more reliable data management.</w:t>
+      </w:r>
+    </w:p>
+    <w:p>
+      <w:pPr>
+        <w:spacing w:line="276" w:lineRule="auto"/>
+        <w:jc w:val="both"/>
+        <w:rPr>
+          <w:color w:val="1F2937"/>
+          <w:sz w:val="26"/>
+          <w:szCs w:val="26"/>
+        </w:rPr>
+      </w:pPr>
+    </w:p>
+    <w:p>
+      <w:pPr>
+        <w:spacing w:line="276" w:lineRule="auto"/>
+        <w:jc w:val="both"/>
+        <w:rPr>
+          <w:color w:val="1F2937"/>
+          <w:sz w:val="26"/>
+          <w:szCs w:val="26"/>
+        </w:rPr>
+      </w:pPr>
+      <w:r>
+        <w:rPr>
+          <w:color w:val="1F2937"/>
+          <w:sz w:val="26"/>
+          <w:szCs w:val="26"/>
+        </w:rPr>
+        <w:t>The third step is database implementation. A MySQL database named "</w:t>
+      </w:r>
+      <w:proofErr w:type="spellStart"/>
+      <w:r>
+        <w:rPr>
+          <w:color w:val="1F2937"/>
+          <w:sz w:val="26"/>
+          <w:szCs w:val="26"/>
+        </w:rPr>
+        <w:t>ai_study_assistant</w:t>
+      </w:r>
+      <w:proofErr w:type="spellEnd"/>
+      <w:r>
+        <w:rPr>
+          <w:color w:val="1F2937"/>
+          <w:sz w:val="26"/>
+          <w:szCs w:val="26"/>
+        </w:rPr>
+        <w:t>" is used to store the application's information. Tables are created to organize different types of academic data. Database operations are performed using Python and the "</w:t>
+      </w:r>
+      <w:proofErr w:type="spellStart"/>
+      <w:proofErr w:type="gramStart"/>
+      <w:r>
+        <w:rPr>
+          <w:color w:val="1F2937"/>
+          <w:sz w:val="26"/>
+          <w:szCs w:val="26"/>
+        </w:rPr>
+        <w:t>mysql.connector</w:t>
+      </w:r>
+      <w:proofErr w:type="spellEnd"/>
+      <w:proofErr w:type="gramEnd"/>
+      <w:r>
+        <w:rPr>
+          <w:color w:val="1F2937"/>
+          <w:sz w:val="26"/>
+          <w:szCs w:val="26"/>
+        </w:rPr>
+        <w:t>" library, allowing the Python program to communicate with the MySQL database.</w:t>
+      </w:r>
+    </w:p>
+    <w:p>
+      <w:pPr>
+        <w:spacing w:line="276" w:lineRule="auto"/>
+        <w:jc w:val="both"/>
+        <w:rPr>
+          <w:color w:val="1F2937"/>
+          <w:sz w:val="26"/>
+          <w:szCs w:val="26"/>
+        </w:rPr>
+      </w:pPr>
+    </w:p>
+    <w:p>
+      <w:pPr>
+        <w:spacing w:line="276" w:lineRule="auto"/>
+        <w:jc w:val="both"/>
+        <w:rPr>
+          <w:color w:val="1F2937"/>
+          <w:sz w:val="26"/>
+          <w:szCs w:val="26"/>
+        </w:rPr>
+        <w:sectPr>
+          <w:headerReference w:type="default" r:id="rId16"/>
+          <w:pgSz w:w="11906" w:h="16838" w:code="9"/>
+          <w:pgMar w:top="1077" w:right="1077" w:bottom="1077" w:left="1440" w:header="709" w:footer="709" w:gutter="0"/>
+          <w:pgBorders w:offsetFrom="page">
+            <w:top w:val="single" w:sz="4" w:space="24" w:color="auto"/>
+            <w:left w:val="single" w:sz="4" w:space="24" w:color="auto"/>
+            <w:bottom w:val="single" w:sz="4" w:space="24" w:color="auto"/>
+            <w:right w:val="single" w:sz="4" w:space="24" w:color="auto"/>
+          </w:pgBorders>
+          <w:cols w:space="708"/>
+          <w:docGrid w:linePitch="360"/>
+        </w:sectPr>
+      </w:pPr>
+      <w:r>
+        <w:rPr>
+          <w:color w:val="1F2937"/>
+          <w:sz w:val="26"/>
+          <w:szCs w:val="26"/>
+        </w:rPr>
+        <w:t>The fourth step is application development. The main application is developed using Python. A menu-driven interface is implemented so that users can select different operations according to their requirements. The program allows users to manage subjects and notes through simple options, making the system easy to understand and use.</w:t>
+      </w:r>
+    </w:p>
+    <w:p>
+      <w:pPr>
+        <w:spacing w:line="276" w:lineRule="auto"/>
+        <w:jc w:val="both"/>
+        <w:rPr>
+          <w:color w:val="1F2937"/>
+          <w:sz w:val="26"/>
+          <w:szCs w:val="26"/>
+        </w:rPr>
+      </w:pPr>
+    </w:p>
+    <w:p>
+      <w:pPr>
+        <w:spacing w:line="276" w:lineRule="auto"/>
+        <w:jc w:val="both"/>
+        <w:rPr>
+          <w:color w:val="1F2937"/>
+          <w:sz w:val="26"/>
+          <w:szCs w:val="26"/>
+        </w:rPr>
+      </w:pPr>
+    </w:p>
+    <w:p>
+      <w:pPr>
+        <w:spacing w:line="276" w:lineRule="auto"/>
+        <w:jc w:val="both"/>
+        <w:rPr>
+          <w:color w:val="1F2937"/>
+          <w:sz w:val="26"/>
+          <w:szCs w:val="26"/>
+        </w:rPr>
+      </w:pPr>
+      <w:r>
+        <w:rPr>
+          <w:color w:val="1F2937"/>
+          <w:sz w:val="26"/>
+          <w:szCs w:val="26"/>
+        </w:rPr>
+        <w:lastRenderedPageBreak/>
+        <w:t>The fifth step is testing and debugging. Each function of the application is tested individually to identify syntax errors, database connection problems, incorrect data handling, and other logical issues. The system is modified whenever an error is identified to improve its reliability and functionality.</w:t>
+      </w:r>
+    </w:p>
+    <w:p>
+      <w:pPr>
+        <w:spacing w:line="276" w:lineRule="auto"/>
+        <w:jc w:val="both"/>
+        <w:rPr>
+          <w:color w:val="1F2937"/>
+          <w:sz w:val="26"/>
+          <w:szCs w:val="26"/>
+        </w:rPr>
+      </w:pPr>
+    </w:p>
+    <w:p>
+      <w:pPr>
+        <w:spacing w:line="276" w:lineRule="auto"/>
+        <w:jc w:val="both"/>
+        <w:rPr>
+          <w:color w:val="1F2937"/>
+          <w:sz w:val="26"/>
+          <w:szCs w:val="26"/>
+        </w:rPr>
+        <w:sectPr>
+          <w:headerReference w:type="default" r:id="rId17"/>
+          <w:type w:val="continuous"/>
+          <w:pgSz w:w="11906" w:h="16838" w:code="9"/>
+          <w:pgMar w:top="1077" w:right="1077" w:bottom="1077" w:left="1440" w:header="709" w:footer="709" w:gutter="0"/>
+          <w:pgBorders w:offsetFrom="page">
+            <w:top w:val="single" w:sz="4" w:space="24" w:color="auto"/>
+            <w:left w:val="single" w:sz="4" w:space="24" w:color="auto"/>
+            <w:bottom w:val="single" w:sz="4" w:space="24" w:color="auto"/>
+            <w:right w:val="single" w:sz="4" w:space="24" w:color="auto"/>
+          </w:pgBorders>
+          <w:cols w:space="708"/>
+          <w:docGrid w:linePitch="360"/>
+        </w:sectPr>
+      </w:pPr>
+      <w:r>
+        <w:rPr>
+          <w:color w:val="1F2937"/>
+          <w:sz w:val="26"/>
+          <w:szCs w:val="26"/>
+        </w:rPr>
+        <w:t>Finally, the working system is evaluated and prepared for future development. Version 1.0 establishes the basic foundation of the AI Study Assistant. In later versions, AI-based features such as question answering, note summarization, quiz generation, personalized study recommendations, and performance analysis can be integrated. This step-by-step methodology allows the project to grow gradually from a basic study management system into a more advanced AI-powered educational assistant.</w:t>
+      </w:r>
+    </w:p>
+    <w:p>
+      <w:pPr>
+        <w:spacing w:line="276" w:lineRule="auto"/>
+        <w:jc w:val="both"/>
+        <w:rPr>
+          <w:color w:val="1F2937"/>
+          <w:sz w:val="26"/>
+          <w:szCs w:val="26"/>
+        </w:rPr>
+      </w:pPr>
+    </w:p>
+    <w:p>
+      <w:pPr>
+        <w:spacing w:line="276" w:lineRule="auto"/>
+        <w:jc w:val="both"/>
+        <w:rPr>
+          <w:color w:val="1F2937"/>
+          <w:sz w:val="26"/>
+          <w:szCs w:val="26"/>
+        </w:rPr>
+      </w:pPr>
+      <w:r>
+        <w:rPr>
+          <w:color w:val="1F2937"/>
+          <w:sz w:val="26"/>
+          <w:szCs w:val="26"/>
+        </w:rPr>
+        <w:t>The development of Version 1.0 of the AI Study Assistant has successfully established the basic working structure of the proposed system. The application has been developed using Python and is capable of performing the fundamental operations required for managing academic subjects and notes.</w:t>
+      </w:r>
+    </w:p>
+    <w:p>
+      <w:pPr>
+        <w:spacing w:line="276" w:lineRule="auto"/>
+        <w:jc w:val="both"/>
+        <w:rPr>
+          <w:color w:val="1F2937"/>
+          <w:sz w:val="26"/>
+          <w:szCs w:val="26"/>
+        </w:rPr>
+      </w:pPr>
+      <w:r>
+        <w:rPr>
+          <w:color w:val="1F2937"/>
+          <w:sz w:val="26"/>
+          <w:szCs w:val="26"/>
+        </w:rPr>
+        <w:t>The system provides a menu-driven interface through which the user can perform different operations. These include viewing subjects, adding new subjects, adding notes, viewing notes, editing existing subjects, editing notes, deleting subjects, and deleting notes. These operations provide the basic functionality required for organizing academic information in one place.</w:t>
+      </w:r>
+    </w:p>
+    <w:p>
+      <w:pPr>
+        <w:spacing w:line="276" w:lineRule="auto"/>
+        <w:jc w:val="both"/>
+        <w:rPr>
+          <w:color w:val="1F2937"/>
+          <w:sz w:val="26"/>
+          <w:szCs w:val="26"/>
+        </w:rPr>
+      </w:pPr>
+      <w:r>
+        <w:rPr>
+          <w:color w:val="1F2937"/>
+          <w:sz w:val="26"/>
+          <w:szCs w:val="26"/>
+        </w:rPr>
+        <w:t>During the initial stage of development, data was handled using a JSON file. This approach helped in developing and testing the basic functionality of the application. As the project progressed, the system entered a transition phase from JSON-based storage to MySQL database storage. A MySQL database named "</w:t>
+      </w:r>
+      <w:proofErr w:type="spellStart"/>
+      <w:r>
+        <w:rPr>
+          <w:color w:val="1F2937"/>
+          <w:sz w:val="26"/>
+          <w:szCs w:val="26"/>
+        </w:rPr>
+        <w:t>ai_study_assistant</w:t>
+      </w:r>
+      <w:proofErr w:type="spellEnd"/>
+      <w:r>
+        <w:rPr>
+          <w:color w:val="1F2937"/>
+          <w:sz w:val="26"/>
+          <w:szCs w:val="26"/>
+        </w:rPr>
+        <w:t>" has been connected with the Python application using the "</w:t>
+      </w:r>
+      <w:proofErr w:type="spellStart"/>
+      <w:proofErr w:type="gramStart"/>
+      <w:r>
+        <w:rPr>
+          <w:color w:val="1F2937"/>
+          <w:sz w:val="26"/>
+          <w:szCs w:val="26"/>
+        </w:rPr>
+        <w:t>mysql.connector</w:t>
+      </w:r>
+      <w:proofErr w:type="spellEnd"/>
+      <w:proofErr w:type="gramEnd"/>
+      <w:r>
+        <w:rPr>
+          <w:color w:val="1F2937"/>
+          <w:sz w:val="26"/>
+          <w:szCs w:val="26"/>
+        </w:rPr>
+        <w:t>" library.</w:t>
+      </w:r>
+    </w:p>
+    <w:p>
+      <w:pPr>
+        <w:spacing w:line="276" w:lineRule="auto"/>
+        <w:jc w:val="both"/>
+        <w:rPr>
+          <w:color w:val="1F2937"/>
+          <w:sz w:val="26"/>
+          <w:szCs w:val="26"/>
+        </w:rPr>
+      </w:pPr>
+      <w:r>
+        <w:rPr>
+          <w:color w:val="1F2937"/>
+          <w:sz w:val="26"/>
+          <w:szCs w:val="26"/>
+        </w:rPr>
+        <w:t>The implementation of MySQL provides a more structured method of storing and managing the application's data. It also creates a suitable foundation for adding relationships between different types of information through database tables and foreign keys in future development.</w:t>
+      </w:r>
+    </w:p>
+    <w:p>
+      <w:pPr>
+        <w:spacing w:line="276" w:lineRule="auto"/>
+        <w:jc w:val="both"/>
+        <w:rPr>
+          <w:color w:val="1F2937"/>
+          <w:sz w:val="26"/>
+          <w:szCs w:val="26"/>
+        </w:rPr>
+      </w:pPr>
+      <w:r>
+        <w:rPr>
+          <w:color w:val="1F2937"/>
+          <w:sz w:val="26"/>
+          <w:szCs w:val="26"/>
+        </w:rPr>
+        <w:t>The major result of Version 1.0 is therefore the successful development of a functional academic management system with the basic features required for an AI Study Assistant. The application can manage subjects and notes through the available operations and provides a foundation on which more advanced features can be developed.</w:t>
+      </w:r>
+    </w:p>
+    <w:p>
+      <w:pPr>
+        <w:spacing w:line="276" w:lineRule="auto"/>
+        <w:jc w:val="both"/>
+        <w:rPr>
+          <w:color w:val="1F2937"/>
+          <w:sz w:val="26"/>
+          <w:szCs w:val="26"/>
+        </w:rPr>
+        <w:sectPr>
+          <w:headerReference w:type="default" r:id="rId18"/>
+          <w:pgSz w:w="11906" w:h="16838" w:code="9"/>
+          <w:pgMar w:top="1077" w:right="1077" w:bottom="1077" w:left="1440" w:header="709" w:footer="709" w:gutter="0"/>
+          <w:pgBorders w:offsetFrom="page">
+            <w:top w:val="single" w:sz="4" w:space="24" w:color="auto"/>
+            <w:left w:val="single" w:sz="4" w:space="24" w:color="auto"/>
+            <w:bottom w:val="single" w:sz="4" w:space="24" w:color="auto"/>
+            <w:right w:val="single" w:sz="4" w:space="24" w:color="auto"/>
+          </w:pgBorders>
+          <w:cols w:space="708"/>
+          <w:docGrid w:linePitch="360"/>
+        </w:sectPr>
+      </w:pPr>
+      <w:r>
+        <w:rPr>
+          <w:color w:val="1F2937"/>
+          <w:sz w:val="26"/>
+          <w:szCs w:val="26"/>
+        </w:rPr>
+        <w:t>At this stage, advanced AI features such as automatic question answering, note summarization, quiz generation, personalized recommendations, and performance</w:t>
+      </w:r>
+    </w:p>
+    <w:p>
+      <w:pPr>
+        <w:spacing w:line="276" w:lineRule="auto"/>
+        <w:jc w:val="both"/>
+        <w:rPr>
+          <w:color w:val="1F2937"/>
+          <w:sz w:val="26"/>
+          <w:szCs w:val="26"/>
+        </w:rPr>
+      </w:pPr>
+      <w:r>
+        <w:rPr>
+          <w:color w:val="1F2937"/>
+          <w:sz w:val="26"/>
+          <w:szCs w:val="26"/>
+        </w:rPr>
+        <w:t xml:space="preserve"> analysis have not yet been fully implemented. These features are considered part of the future development of the project.</w:t>
+      </w:r>
+    </w:p>
+    <w:p>
+      <w:pPr>
+        <w:spacing w:line="276" w:lineRule="auto"/>
+        <w:jc w:val="both"/>
+        <w:rPr>
+          <w:color w:val="1F2937"/>
+          <w:sz w:val="26"/>
+          <w:szCs w:val="26"/>
+        </w:rPr>
+      </w:pPr>
+      <w:r>
+        <w:rPr>
+          <w:color w:val="1F2937"/>
+          <w:sz w:val="26"/>
+          <w:szCs w:val="26"/>
+        </w:rPr>
+        <w:t>Overall, the results of Version 1.0 indicate that the basic system is working and provides a practical foundation for the further development of the AI Study Assistant. The successful transition toward database-based storage also makes the project more scalable and suitable for adding advanced features in future versions.</w:t>
       </w:r>
     </w:p>
     <w:sectPr>
-      <w:headerReference w:type="default" r:id="rId10"/>
+      <w:headerReference w:type="default" r:id="rId19"/>
+      <w:type w:val="continuous"/>
       <w:pgSz w:w="11906" w:h="16838" w:code="9"/>
       <w:pgMar w:top="1077" w:right="1077" w:bottom="1077" w:left="1440" w:header="709" w:footer="709" w:gutter="0"/>
       <w:pgBorders w:offsetFrom="page">
@@ -586,6 +1870,77 @@
       </w:rPr>
       <w:t>T</w:t>
     </w:r>
+  </w:p>
+</w:hdr>
+</file>
+
+<file path=word/header10.xml><?xml version="1.0" encoding="utf-8"?>
+<w:hdr xmlns:wpc="http://schemas.microsoft.com/office/word/2010/wordprocessingCanvas" xmlns:cx="http://schemas.microsoft.com/office/drawing/2014/chartex" xmlns:cx1="http://schemas.microsoft.com/office/drawing/2015/9/8/chartex" xmlns:cx2="http://schemas.microsoft.com/office/drawing/2015/10/21/chartex" xmlns:cx3="http://schemas.microsoft.com/office/drawing/2016/5/9/chartex" xmlns:cx4="http://schemas.microsoft.com/office/drawing/2016/5/10/chartex" xmlns:cx5="http://schemas.microsoft.com/office/drawing/2016/5/11/chartex" xmlns:cx6="http://schemas.microsoft.com/office/drawing/2016/5/12/chartex" xmlns:cx7="http://schemas.microsoft.com/office/drawing/2016/5/13/chartex" xmlns:cx8="http://schemas.microsoft.com/office/drawing/2016/5/14/chartex" xmlns:mc="http://schemas.openxmlformats.org/markup-compatibility/2006" xmlns:aink="http://schemas.microsoft.com/office/drawing/2016/ink" xmlns:am3d="http://schemas.microsoft.com/office/drawing/2017/model3d" xmlns:o="urn:schemas-microsoft-com:office:office" xmlns:oel="http://schemas.microsoft.com/office/2019/extlst" xmlns:r="http://schemas.openxmlformats.org/officeDocument/2006/relationships" xmlns:m="http://schemas.openxmlformats.org/officeDocument/2006/math" xmlns:v="urn:schemas-microsoft-com:vml" xmlns:wp14="http://schemas.microsoft.com/office/word/2010/wordprocessingDrawing" xmlns:wp="http://schemas.openxmlformats.org/drawingml/2006/wordprocessingDrawing" xmlns:w10="urn:schemas-microsoft-com:office:word" xmlns:w="http://schemas.openxmlformats.org/wordprocessingml/2006/main" xmlns:w14="http://schemas.microsoft.com/office/word/2010/wordml" xmlns:w15="http://schemas.microsoft.com/office/word/2012/wordml" xmlns:w16cex="http://schemas.microsoft.com/office/word/2018/wordml/cex" xmlns:w16cid="http://schemas.microsoft.com/office/word/2016/wordml/cid" xmlns:w16="http://schemas.microsoft.com/office/word/2018/wordml" xmlns:w16du="http://schemas.microsoft.com/office/word/2023/wordml/word16du" xmlns:w16sdtdh="http://schemas.microsoft.com/office/word/2020/wordml/sdtdatahash" xmlns:w16sdtfl="http://schemas.microsoft.com/office/word/2024/wordml/sdtformatlock" xmlns:w16se="http://schemas.microsoft.com/office/word/2015/wordml/symex" xmlns:wpg="http://schemas.microsoft.com/office/word/2010/wordprocessingGroup" xmlns:wpi="http://schemas.microsoft.com/office/word/2010/wordprocessingInk" xmlns:wne="http://schemas.microsoft.com/office/word/2006/wordml" xmlns:wps="http://schemas.microsoft.com/office/word/2010/wordprocessingShape" mc:Ignorable="w14 w15 w16se w16cid w16 w16cex w16sdtdh w16sdtfl w16du wp14">
+  <w:p>
+    <w:pPr>
+      <w:pStyle w:val="Header"/>
+      <w:rPr>
+        <w:rFonts w:asciiTheme="majorHAnsi" w:hAnsiTheme="majorHAnsi" w:cs="Calibri"/>
+        <w:b/>
+        <w:bCs/>
+        <w:color w:val="172554"/>
+        <w:sz w:val="56"/>
+        <w:szCs w:val="56"/>
+        <w:lang w:val="en-US"/>
+      </w:rPr>
+    </w:pPr>
+  </w:p>
+</w:hdr>
+</file>
+
+<file path=word/header11.xml><?xml version="1.0" encoding="utf-8"?>
+<w:hdr xmlns:wpc="http://schemas.microsoft.com/office/word/2010/wordprocessingCanvas" xmlns:cx="http://schemas.microsoft.com/office/drawing/2014/chartex" xmlns:cx1="http://schemas.microsoft.com/office/drawing/2015/9/8/chartex" xmlns:cx2="http://schemas.microsoft.com/office/drawing/2015/10/21/chartex" xmlns:cx3="http://schemas.microsoft.com/office/drawing/2016/5/9/chartex" xmlns:cx4="http://schemas.microsoft.com/office/drawing/2016/5/10/chartex" xmlns:cx5="http://schemas.microsoft.com/office/drawing/2016/5/11/chartex" xmlns:cx6="http://schemas.microsoft.com/office/drawing/2016/5/12/chartex" xmlns:cx7="http://schemas.microsoft.com/office/drawing/2016/5/13/chartex" xmlns:cx8="http://schemas.microsoft.com/office/drawing/2016/5/14/chartex" xmlns:mc="http://schemas.openxmlformats.org/markup-compatibility/2006" xmlns:aink="http://schemas.microsoft.com/office/drawing/2016/ink" xmlns:am3d="http://schemas.microsoft.com/office/drawing/2017/model3d" xmlns:o="urn:schemas-microsoft-com:office:office" xmlns:oel="http://schemas.microsoft.com/office/2019/extlst" xmlns:r="http://schemas.openxmlformats.org/officeDocument/2006/relationships" xmlns:m="http://schemas.openxmlformats.org/officeDocument/2006/math" xmlns:v="urn:schemas-microsoft-com:vml" xmlns:wp14="http://schemas.microsoft.com/office/word/2010/wordprocessingDrawing" xmlns:wp="http://schemas.openxmlformats.org/drawingml/2006/wordprocessingDrawing" xmlns:w10="urn:schemas-microsoft-com:office:word" xmlns:w="http://schemas.openxmlformats.org/wordprocessingml/2006/main" xmlns:w14="http://schemas.microsoft.com/office/word/2010/wordml" xmlns:w15="http://schemas.microsoft.com/office/word/2012/wordml" xmlns:w16cex="http://schemas.microsoft.com/office/word/2018/wordml/cex" xmlns:w16cid="http://schemas.microsoft.com/office/word/2016/wordml/cid" xmlns:w16="http://schemas.microsoft.com/office/word/2018/wordml" xmlns:w16du="http://schemas.microsoft.com/office/word/2023/wordml/word16du" xmlns:w16sdtdh="http://schemas.microsoft.com/office/word/2020/wordml/sdtdatahash" xmlns:w16sdtfl="http://schemas.microsoft.com/office/word/2024/wordml/sdtformatlock" xmlns:w16se="http://schemas.microsoft.com/office/word/2015/wordml/symex" xmlns:wpg="http://schemas.microsoft.com/office/word/2010/wordprocessingGroup" xmlns:wpi="http://schemas.microsoft.com/office/word/2010/wordprocessingInk" xmlns:wne="http://schemas.microsoft.com/office/word/2006/wordml" xmlns:wps="http://schemas.microsoft.com/office/word/2010/wordprocessingShape" mc:Ignorable="w14 w15 w16se w16cid w16 w16cex w16sdtdh w16sdtfl w16du wp14">
+  <w:p>
+    <w:pPr>
+      <w:pStyle w:val="Header"/>
+      <w:jc w:val="center"/>
+      <w:rPr>
+        <w:rFonts w:asciiTheme="majorHAnsi" w:hAnsiTheme="majorHAnsi" w:cs="Calibri"/>
+        <w:b/>
+        <w:bCs/>
+        <w:color w:val="172554"/>
+        <w:sz w:val="56"/>
+        <w:szCs w:val="56"/>
+        <w:lang w:val="en-US"/>
+      </w:rPr>
+    </w:pPr>
+    <w:r>
+      <w:rPr>
+        <w:rFonts w:asciiTheme="majorHAnsi" w:hAnsiTheme="majorHAnsi" w:cs="Calibri"/>
+        <w:b/>
+        <w:bCs/>
+        <w:color w:val="172554"/>
+        <w:sz w:val="56"/>
+        <w:szCs w:val="56"/>
+        <w:lang w:val="en-US"/>
+      </w:rPr>
+      <w:t>RESULTS</w:t>
+    </w:r>
+  </w:p>
+</w:hdr>
+</file>
+
+<file path=word/header12.xml><?xml version="1.0" encoding="utf-8"?>
+<w:hdr xmlns:wpc="http://schemas.microsoft.com/office/word/2010/wordprocessingCanvas" xmlns:cx="http://schemas.microsoft.com/office/drawing/2014/chartex" xmlns:cx1="http://schemas.microsoft.com/office/drawing/2015/9/8/chartex" xmlns:cx2="http://schemas.microsoft.com/office/drawing/2015/10/21/chartex" xmlns:cx3="http://schemas.microsoft.com/office/drawing/2016/5/9/chartex" xmlns:cx4="http://schemas.microsoft.com/office/drawing/2016/5/10/chartex" xmlns:cx5="http://schemas.microsoft.com/office/drawing/2016/5/11/chartex" xmlns:cx6="http://schemas.microsoft.com/office/drawing/2016/5/12/chartex" xmlns:cx7="http://schemas.microsoft.com/office/drawing/2016/5/13/chartex" xmlns:cx8="http://schemas.microsoft.com/office/drawing/2016/5/14/chartex" xmlns:mc="http://schemas.openxmlformats.org/markup-compatibility/2006" xmlns:aink="http://schemas.microsoft.com/office/drawing/2016/ink" xmlns:am3d="http://schemas.microsoft.com/office/drawing/2017/model3d" xmlns:o="urn:schemas-microsoft-com:office:office" xmlns:oel="http://schemas.microsoft.com/office/2019/extlst" xmlns:r="http://schemas.openxmlformats.org/officeDocument/2006/relationships" xmlns:m="http://schemas.openxmlformats.org/officeDocument/2006/math" xmlns:v="urn:schemas-microsoft-com:vml" xmlns:wp14="http://schemas.microsoft.com/office/word/2010/wordprocessingDrawing" xmlns:wp="http://schemas.openxmlformats.org/drawingml/2006/wordprocessingDrawing" xmlns:w10="urn:schemas-microsoft-com:office:word" xmlns:w="http://schemas.openxmlformats.org/wordprocessingml/2006/main" xmlns:w14="http://schemas.microsoft.com/office/word/2010/wordml" xmlns:w15="http://schemas.microsoft.com/office/word/2012/wordml" xmlns:w16cex="http://schemas.microsoft.com/office/word/2018/wordml/cex" xmlns:w16cid="http://schemas.microsoft.com/office/word/2016/wordml/cid" xmlns:w16="http://schemas.microsoft.com/office/word/2018/wordml" xmlns:w16du="http://schemas.microsoft.com/office/word/2023/wordml/word16du" xmlns:w16sdtdh="http://schemas.microsoft.com/office/word/2020/wordml/sdtdatahash" xmlns:w16sdtfl="http://schemas.microsoft.com/office/word/2024/wordml/sdtformatlock" xmlns:w16se="http://schemas.microsoft.com/office/word/2015/wordml/symex" xmlns:wpg="http://schemas.microsoft.com/office/word/2010/wordprocessingGroup" xmlns:wpi="http://schemas.microsoft.com/office/word/2010/wordprocessingInk" xmlns:wne="http://schemas.microsoft.com/office/word/2006/wordml" xmlns:wps="http://schemas.microsoft.com/office/word/2010/wordprocessingShape" mc:Ignorable="w14 w15 w16se w16cid w16 w16cex w16sdtdh w16sdtfl w16du wp14">
+  <w:p>
+    <w:pPr>
+      <w:pStyle w:val="Header"/>
+      <w:jc w:val="center"/>
+      <w:rPr>
+        <w:rFonts w:asciiTheme="majorHAnsi" w:hAnsiTheme="majorHAnsi" w:cs="Calibri"/>
+        <w:b/>
+        <w:bCs/>
+        <w:color w:val="172554"/>
+        <w:sz w:val="56"/>
+        <w:szCs w:val="56"/>
+        <w:lang w:val="en-US"/>
+      </w:rPr>
+    </w:pPr>
   </w:p>
 </w:hdr>
 </file>
@@ -658,6 +2013,275 @@
     </w:pPr>
   </w:p>
 </w:hdr>
+</file>
+
+<file path=word/header5.xml><?xml version="1.0" encoding="utf-8"?>
+<w:hdr xmlns:wpc="http://schemas.microsoft.com/office/word/2010/wordprocessingCanvas" xmlns:cx="http://schemas.microsoft.com/office/drawing/2014/chartex" xmlns:cx1="http://schemas.microsoft.com/office/drawing/2015/9/8/chartex" xmlns:cx2="http://schemas.microsoft.com/office/drawing/2015/10/21/chartex" xmlns:cx3="http://schemas.microsoft.com/office/drawing/2016/5/9/chartex" xmlns:cx4="http://schemas.microsoft.com/office/drawing/2016/5/10/chartex" xmlns:cx5="http://schemas.microsoft.com/office/drawing/2016/5/11/chartex" xmlns:cx6="http://schemas.microsoft.com/office/drawing/2016/5/12/chartex" xmlns:cx7="http://schemas.microsoft.com/office/drawing/2016/5/13/chartex" xmlns:cx8="http://schemas.microsoft.com/office/drawing/2016/5/14/chartex" xmlns:mc="http://schemas.openxmlformats.org/markup-compatibility/2006" xmlns:aink="http://schemas.microsoft.com/office/drawing/2016/ink" xmlns:am3d="http://schemas.microsoft.com/office/drawing/2017/model3d" xmlns:o="urn:schemas-microsoft-com:office:office" xmlns:oel="http://schemas.microsoft.com/office/2019/extlst" xmlns:r="http://schemas.openxmlformats.org/officeDocument/2006/relationships" xmlns:m="http://schemas.openxmlformats.org/officeDocument/2006/math" xmlns:v="urn:schemas-microsoft-com:vml" xmlns:wp14="http://schemas.microsoft.com/office/word/2010/wordprocessingDrawing" xmlns:wp="http://schemas.openxmlformats.org/drawingml/2006/wordprocessingDrawing" xmlns:w10="urn:schemas-microsoft-com:office:word" xmlns:w="http://schemas.openxmlformats.org/wordprocessingml/2006/main" xmlns:w14="http://schemas.microsoft.com/office/word/2010/wordml" xmlns:w15="http://schemas.microsoft.com/office/word/2012/wordml" xmlns:w16cex="http://schemas.microsoft.com/office/word/2018/wordml/cex" xmlns:w16cid="http://schemas.microsoft.com/office/word/2016/wordml/cid" xmlns:w16="http://schemas.microsoft.com/office/word/2018/wordml" xmlns:w16du="http://schemas.microsoft.com/office/word/2023/wordml/word16du" xmlns:w16sdtdh="http://schemas.microsoft.com/office/word/2020/wordml/sdtdatahash" xmlns:w16sdtfl="http://schemas.microsoft.com/office/word/2024/wordml/sdtformatlock" xmlns:w16se="http://schemas.microsoft.com/office/word/2015/wordml/symex" xmlns:wpg="http://schemas.microsoft.com/office/word/2010/wordprocessingGroup" xmlns:wpi="http://schemas.microsoft.com/office/word/2010/wordprocessingInk" xmlns:wne="http://schemas.microsoft.com/office/word/2006/wordml" xmlns:wps="http://schemas.microsoft.com/office/word/2010/wordprocessingShape" mc:Ignorable="w14 w15 w16se w16cid w16 w16cex w16sdtdh w16sdtfl w16du wp14">
+  <w:p>
+    <w:pPr>
+      <w:pStyle w:val="Header"/>
+      <w:jc w:val="center"/>
+      <w:rPr>
+        <w:rFonts w:asciiTheme="majorHAnsi" w:hAnsiTheme="majorHAnsi" w:cs="Calibri"/>
+        <w:b/>
+        <w:bCs/>
+        <w:color w:val="172554"/>
+        <w:sz w:val="56"/>
+        <w:szCs w:val="56"/>
+        <w:lang w:val="en-US"/>
+      </w:rPr>
+    </w:pPr>
+    <w:r>
+      <w:rPr>
+        <w:rFonts w:asciiTheme="majorHAnsi" w:hAnsiTheme="majorHAnsi" w:cs="Calibri"/>
+        <w:b/>
+        <w:bCs/>
+        <w:color w:val="172554"/>
+        <w:sz w:val="56"/>
+        <w:szCs w:val="56"/>
+        <w:lang w:val="en-US"/>
+      </w:rPr>
+      <w:t>LITERATURE REVIEW</w:t>
+    </w:r>
+  </w:p>
+</w:hdr>
+</file>
+
+<file path=word/header6.xml><?xml version="1.0" encoding="utf-8"?>
+<w:hdr xmlns:wpc="http://schemas.microsoft.com/office/word/2010/wordprocessingCanvas" xmlns:cx="http://schemas.microsoft.com/office/drawing/2014/chartex" xmlns:cx1="http://schemas.microsoft.com/office/drawing/2015/9/8/chartex" xmlns:cx2="http://schemas.microsoft.com/office/drawing/2015/10/21/chartex" xmlns:cx3="http://schemas.microsoft.com/office/drawing/2016/5/9/chartex" xmlns:cx4="http://schemas.microsoft.com/office/drawing/2016/5/10/chartex" xmlns:cx5="http://schemas.microsoft.com/office/drawing/2016/5/11/chartex" xmlns:cx6="http://schemas.microsoft.com/office/drawing/2016/5/12/chartex" xmlns:cx7="http://schemas.microsoft.com/office/drawing/2016/5/13/chartex" xmlns:cx8="http://schemas.microsoft.com/office/drawing/2016/5/14/chartex" xmlns:mc="http://schemas.openxmlformats.org/markup-compatibility/2006" xmlns:aink="http://schemas.microsoft.com/office/drawing/2016/ink" xmlns:am3d="http://schemas.microsoft.com/office/drawing/2017/model3d" xmlns:o="urn:schemas-microsoft-com:office:office" xmlns:oel="http://schemas.microsoft.com/office/2019/extlst" xmlns:r="http://schemas.openxmlformats.org/officeDocument/2006/relationships" xmlns:m="http://schemas.openxmlformats.org/officeDocument/2006/math" xmlns:v="urn:schemas-microsoft-com:vml" xmlns:wp14="http://schemas.microsoft.com/office/word/2010/wordprocessingDrawing" xmlns:wp="http://schemas.openxmlformats.org/drawingml/2006/wordprocessingDrawing" xmlns:w10="urn:schemas-microsoft-com:office:word" xmlns:w="http://schemas.openxmlformats.org/wordprocessingml/2006/main" xmlns:w14="http://schemas.microsoft.com/office/word/2010/wordml" xmlns:w15="http://schemas.microsoft.com/office/word/2012/wordml" xmlns:w16cex="http://schemas.microsoft.com/office/word/2018/wordml/cex" xmlns:w16cid="http://schemas.microsoft.com/office/word/2016/wordml/cid" xmlns:w16="http://schemas.microsoft.com/office/word/2018/wordml" xmlns:w16du="http://schemas.microsoft.com/office/word/2023/wordml/word16du" xmlns:w16sdtdh="http://schemas.microsoft.com/office/word/2020/wordml/sdtdatahash" xmlns:w16sdtfl="http://schemas.microsoft.com/office/word/2024/wordml/sdtformatlock" xmlns:w16se="http://schemas.microsoft.com/office/word/2015/wordml/symex" xmlns:wpg="http://schemas.microsoft.com/office/word/2010/wordprocessingGroup" xmlns:wpi="http://schemas.microsoft.com/office/word/2010/wordprocessingInk" xmlns:wne="http://schemas.microsoft.com/office/word/2006/wordml" xmlns:wps="http://schemas.microsoft.com/office/word/2010/wordprocessingShape" mc:Ignorable="w14 w15 w16se w16cid w16 w16cex w16sdtdh w16sdtfl w16du wp14">
+  <w:p>
+    <w:pPr>
+      <w:pStyle w:val="Header"/>
+      <w:jc w:val="center"/>
+      <w:rPr>
+        <w:rFonts w:asciiTheme="majorHAnsi" w:hAnsiTheme="majorHAnsi" w:cs="Calibri"/>
+        <w:b/>
+        <w:bCs/>
+        <w:color w:val="172554"/>
+        <w:sz w:val="56"/>
+        <w:szCs w:val="56"/>
+        <w:lang w:val="en-US"/>
+      </w:rPr>
+    </w:pPr>
+  </w:p>
+</w:hdr>
+</file>
+
+<file path=word/header7.xml><?xml version="1.0" encoding="utf-8"?>
+<w:hdr xmlns:wpc="http://schemas.microsoft.com/office/word/2010/wordprocessingCanvas" xmlns:cx="http://schemas.microsoft.com/office/drawing/2014/chartex" xmlns:cx1="http://schemas.microsoft.com/office/drawing/2015/9/8/chartex" xmlns:cx2="http://schemas.microsoft.com/office/drawing/2015/10/21/chartex" xmlns:cx3="http://schemas.microsoft.com/office/drawing/2016/5/9/chartex" xmlns:cx4="http://schemas.microsoft.com/office/drawing/2016/5/10/chartex" xmlns:cx5="http://schemas.microsoft.com/office/drawing/2016/5/11/chartex" xmlns:cx6="http://schemas.microsoft.com/office/drawing/2016/5/12/chartex" xmlns:cx7="http://schemas.microsoft.com/office/drawing/2016/5/13/chartex" xmlns:cx8="http://schemas.microsoft.com/office/drawing/2016/5/14/chartex" xmlns:mc="http://schemas.openxmlformats.org/markup-compatibility/2006" xmlns:aink="http://schemas.microsoft.com/office/drawing/2016/ink" xmlns:am3d="http://schemas.microsoft.com/office/drawing/2017/model3d" xmlns:o="urn:schemas-microsoft-com:office:office" xmlns:oel="http://schemas.microsoft.com/office/2019/extlst" xmlns:r="http://schemas.openxmlformats.org/officeDocument/2006/relationships" xmlns:m="http://schemas.openxmlformats.org/officeDocument/2006/math" xmlns:v="urn:schemas-microsoft-com:vml" xmlns:wp14="http://schemas.microsoft.com/office/word/2010/wordprocessingDrawing" xmlns:wp="http://schemas.openxmlformats.org/drawingml/2006/wordprocessingDrawing" xmlns:w10="urn:schemas-microsoft-com:office:word" xmlns:w="http://schemas.openxmlformats.org/wordprocessingml/2006/main" xmlns:w14="http://schemas.microsoft.com/office/word/2010/wordml" xmlns:w15="http://schemas.microsoft.com/office/word/2012/wordml" xmlns:w16cex="http://schemas.microsoft.com/office/word/2018/wordml/cex" xmlns:w16cid="http://schemas.microsoft.com/office/word/2016/wordml/cid" xmlns:w16="http://schemas.microsoft.com/office/word/2018/wordml" xmlns:w16du="http://schemas.microsoft.com/office/word/2023/wordml/word16du" xmlns:w16sdtdh="http://schemas.microsoft.com/office/word/2020/wordml/sdtdatahash" xmlns:w16sdtfl="http://schemas.microsoft.com/office/word/2024/wordml/sdtformatlock" xmlns:w16se="http://schemas.microsoft.com/office/word/2015/wordml/symex" xmlns:wpg="http://schemas.microsoft.com/office/word/2010/wordprocessingGroup" xmlns:wpi="http://schemas.microsoft.com/office/word/2010/wordprocessingInk" xmlns:wne="http://schemas.microsoft.com/office/word/2006/wordml" xmlns:wps="http://schemas.microsoft.com/office/word/2010/wordprocessingShape" mc:Ignorable="w14 w15 w16se w16cid w16 w16cex w16sdtdh w16sdtfl w16du wp14">
+  <w:p>
+    <w:pPr>
+      <w:pStyle w:val="Header"/>
+      <w:jc w:val="center"/>
+      <w:rPr>
+        <w:rFonts w:asciiTheme="majorHAnsi" w:hAnsiTheme="majorHAnsi" w:cs="Calibri"/>
+        <w:b/>
+        <w:bCs/>
+        <w:color w:val="172554"/>
+        <w:sz w:val="56"/>
+        <w:szCs w:val="56"/>
+        <w:lang w:val="en-US"/>
+      </w:rPr>
+    </w:pPr>
+    <w:r>
+      <w:rPr>
+        <w:rFonts w:asciiTheme="majorHAnsi" w:hAnsiTheme="majorHAnsi" w:cs="Calibri"/>
+        <w:b/>
+        <w:bCs/>
+        <w:color w:val="172554"/>
+        <w:sz w:val="56"/>
+        <w:szCs w:val="56"/>
+        <w:lang w:val="en-US"/>
+      </w:rPr>
+      <w:t>OBJECTIVES</w:t>
+    </w:r>
+  </w:p>
+</w:hdr>
+</file>
+
+<file path=word/header8.xml><?xml version="1.0" encoding="utf-8"?>
+<w:hdr xmlns:wpc="http://schemas.microsoft.com/office/word/2010/wordprocessingCanvas" xmlns:cx="http://schemas.microsoft.com/office/drawing/2014/chartex" xmlns:cx1="http://schemas.microsoft.com/office/drawing/2015/9/8/chartex" xmlns:cx2="http://schemas.microsoft.com/office/drawing/2015/10/21/chartex" xmlns:cx3="http://schemas.microsoft.com/office/drawing/2016/5/9/chartex" xmlns:cx4="http://schemas.microsoft.com/office/drawing/2016/5/10/chartex" xmlns:cx5="http://schemas.microsoft.com/office/drawing/2016/5/11/chartex" xmlns:cx6="http://schemas.microsoft.com/office/drawing/2016/5/12/chartex" xmlns:cx7="http://schemas.microsoft.com/office/drawing/2016/5/13/chartex" xmlns:cx8="http://schemas.microsoft.com/office/drawing/2016/5/14/chartex" xmlns:mc="http://schemas.openxmlformats.org/markup-compatibility/2006" xmlns:aink="http://schemas.microsoft.com/office/drawing/2016/ink" xmlns:am3d="http://schemas.microsoft.com/office/drawing/2017/model3d" xmlns:o="urn:schemas-microsoft-com:office:office" xmlns:oel="http://schemas.microsoft.com/office/2019/extlst" xmlns:r="http://schemas.openxmlformats.org/officeDocument/2006/relationships" xmlns:m="http://schemas.openxmlformats.org/officeDocument/2006/math" xmlns:v="urn:schemas-microsoft-com:vml" xmlns:wp14="http://schemas.microsoft.com/office/word/2010/wordprocessingDrawing" xmlns:wp="http://schemas.openxmlformats.org/drawingml/2006/wordprocessingDrawing" xmlns:w10="urn:schemas-microsoft-com:office:word" xmlns:w="http://schemas.openxmlformats.org/wordprocessingml/2006/main" xmlns:w14="http://schemas.microsoft.com/office/word/2010/wordml" xmlns:w15="http://schemas.microsoft.com/office/word/2012/wordml" xmlns:w16cex="http://schemas.microsoft.com/office/word/2018/wordml/cex" xmlns:w16cid="http://schemas.microsoft.com/office/word/2016/wordml/cid" xmlns:w16="http://schemas.microsoft.com/office/word/2018/wordml" xmlns:w16du="http://schemas.microsoft.com/office/word/2023/wordml/word16du" xmlns:w16sdtdh="http://schemas.microsoft.com/office/word/2020/wordml/sdtdatahash" xmlns:w16sdtfl="http://schemas.microsoft.com/office/word/2024/wordml/sdtformatlock" xmlns:w16se="http://schemas.microsoft.com/office/word/2015/wordml/symex" xmlns:wpg="http://schemas.microsoft.com/office/word/2010/wordprocessingGroup" xmlns:wpi="http://schemas.microsoft.com/office/word/2010/wordprocessingInk" xmlns:wne="http://schemas.microsoft.com/office/word/2006/wordml" xmlns:wps="http://schemas.microsoft.com/office/word/2010/wordprocessingShape" mc:Ignorable="w14 w15 w16se w16cid w16 w16cex w16sdtdh w16sdtfl w16du wp14">
+  <w:p>
+    <w:pPr>
+      <w:pStyle w:val="Header"/>
+      <w:jc w:val="center"/>
+      <w:rPr>
+        <w:rFonts w:asciiTheme="majorHAnsi" w:hAnsiTheme="majorHAnsi" w:cs="Calibri"/>
+        <w:b/>
+        <w:bCs/>
+        <w:color w:val="172554"/>
+        <w:sz w:val="56"/>
+        <w:szCs w:val="56"/>
+        <w:lang w:val="en-US"/>
+      </w:rPr>
+    </w:pPr>
+    <w:r>
+      <w:rPr>
+        <w:rFonts w:asciiTheme="majorHAnsi" w:hAnsiTheme="majorHAnsi" w:cs="Calibri"/>
+        <w:b/>
+        <w:bCs/>
+        <w:color w:val="172554"/>
+        <w:sz w:val="56"/>
+        <w:szCs w:val="56"/>
+        <w:lang w:val="en-US"/>
+      </w:rPr>
+      <w:t>HYPOTHESIS</w:t>
+    </w:r>
+  </w:p>
+</w:hdr>
+</file>
+
+<file path=word/header9.xml><?xml version="1.0" encoding="utf-8"?>
+<w:hdr xmlns:wpc="http://schemas.microsoft.com/office/word/2010/wordprocessingCanvas" xmlns:cx="http://schemas.microsoft.com/office/drawing/2014/chartex" xmlns:cx1="http://schemas.microsoft.com/office/drawing/2015/9/8/chartex" xmlns:cx2="http://schemas.microsoft.com/office/drawing/2015/10/21/chartex" xmlns:cx3="http://schemas.microsoft.com/office/drawing/2016/5/9/chartex" xmlns:cx4="http://schemas.microsoft.com/office/drawing/2016/5/10/chartex" xmlns:cx5="http://schemas.microsoft.com/office/drawing/2016/5/11/chartex" xmlns:cx6="http://schemas.microsoft.com/office/drawing/2016/5/12/chartex" xmlns:cx7="http://schemas.microsoft.com/office/drawing/2016/5/13/chartex" xmlns:cx8="http://schemas.microsoft.com/office/drawing/2016/5/14/chartex" xmlns:mc="http://schemas.openxmlformats.org/markup-compatibility/2006" xmlns:aink="http://schemas.microsoft.com/office/drawing/2016/ink" xmlns:am3d="http://schemas.microsoft.com/office/drawing/2017/model3d" xmlns:o="urn:schemas-microsoft-com:office:office" xmlns:oel="http://schemas.microsoft.com/office/2019/extlst" xmlns:r="http://schemas.openxmlformats.org/officeDocument/2006/relationships" xmlns:m="http://schemas.openxmlformats.org/officeDocument/2006/math" xmlns:v="urn:schemas-microsoft-com:vml" xmlns:wp14="http://schemas.microsoft.com/office/word/2010/wordprocessingDrawing" xmlns:wp="http://schemas.openxmlformats.org/drawingml/2006/wordprocessingDrawing" xmlns:w10="urn:schemas-microsoft-com:office:word" xmlns:w="http://schemas.openxmlformats.org/wordprocessingml/2006/main" xmlns:w14="http://schemas.microsoft.com/office/word/2010/wordml" xmlns:w15="http://schemas.microsoft.com/office/word/2012/wordml" xmlns:w16cex="http://schemas.microsoft.com/office/word/2018/wordml/cex" xmlns:w16cid="http://schemas.microsoft.com/office/word/2016/wordml/cid" xmlns:w16="http://schemas.microsoft.com/office/word/2018/wordml" xmlns:w16du="http://schemas.microsoft.com/office/word/2023/wordml/word16du" xmlns:w16sdtdh="http://schemas.microsoft.com/office/word/2020/wordml/sdtdatahash" xmlns:w16sdtfl="http://schemas.microsoft.com/office/word/2024/wordml/sdtformatlock" xmlns:w16se="http://schemas.microsoft.com/office/word/2015/wordml/symex" xmlns:wpg="http://schemas.microsoft.com/office/word/2010/wordprocessingGroup" xmlns:wpi="http://schemas.microsoft.com/office/word/2010/wordprocessingInk" xmlns:wne="http://schemas.microsoft.com/office/word/2006/wordml" xmlns:wps="http://schemas.microsoft.com/office/word/2010/wordprocessingShape" mc:Ignorable="w14 w15 w16se w16cid w16 w16cex w16sdtdh w16sdtfl w16du wp14">
+  <w:p>
+    <w:pPr>
+      <w:pStyle w:val="Header"/>
+      <w:jc w:val="center"/>
+      <w:rPr>
+        <w:rFonts w:asciiTheme="majorHAnsi" w:hAnsiTheme="majorHAnsi" w:cs="Calibri"/>
+        <w:b/>
+        <w:bCs/>
+        <w:color w:val="172554"/>
+        <w:sz w:val="56"/>
+        <w:szCs w:val="56"/>
+        <w:lang w:val="en-US"/>
+      </w:rPr>
+    </w:pPr>
+    <w:r>
+      <w:rPr>
+        <w:rFonts w:asciiTheme="majorHAnsi" w:hAnsiTheme="majorHAnsi" w:cs="Calibri"/>
+        <w:b/>
+        <w:bCs/>
+        <w:color w:val="172554"/>
+        <w:sz w:val="56"/>
+        <w:szCs w:val="56"/>
+        <w:lang w:val="en-US"/>
+      </w:rPr>
+      <w:t>METHODOLOGY</w:t>
+    </w:r>
+  </w:p>
+</w:hdr>
+</file>
+
+<file path=word/numbering.xml><?xml version="1.0" encoding="utf-8"?>
+<w:numbering xmlns:wpc="http://schemas.microsoft.com/office/word/2010/wordprocessingCanvas" xmlns:cx="http://schemas.microsoft.com/office/drawing/2014/chartex" xmlns:cx1="http://schemas.microsoft.com/office/drawing/2015/9/8/chartex" xmlns:cx2="http://schemas.microsoft.com/office/drawing/2015/10/21/chartex" xmlns:cx3="http://schemas.microsoft.com/office/drawing/2016/5/9/chartex" xmlns:cx4="http://schemas.microsoft.com/office/drawing/2016/5/10/chartex" xmlns:cx5="http://schemas.microsoft.com/office/drawing/2016/5/11/chartex" xmlns:cx6="http://schemas.microsoft.com/office/drawing/2016/5/12/chartex" xmlns:cx7="http://schemas.microsoft.com/office/drawing/2016/5/13/chartex" xmlns:cx8="http://schemas.microsoft.com/office/drawing/2016/5/14/chartex" xmlns:mc="http://schemas.openxmlformats.org/markup-compatibility/2006" xmlns:aink="http://schemas.microsoft.com/office/drawing/2016/ink" xmlns:am3d="http://schemas.microsoft.com/office/drawing/2017/model3d" xmlns:o="urn:schemas-microsoft-com:office:office" xmlns:oel="http://schemas.microsoft.com/office/2019/extlst" xmlns:r="http://schemas.openxmlformats.org/officeDocument/2006/relationships" xmlns:m="http://schemas.openxmlformats.org/officeDocument/2006/math" xmlns:v="urn:schemas-microsoft-com:vml" xmlns:wp14="http://schemas.microsoft.com/office/word/2010/wordprocessingDrawing" xmlns:wp="http://schemas.openxmlformats.org/drawingml/2006/wordprocessingDrawing" xmlns:w10="urn:schemas-microsoft-com:office:word" xmlns:w="http://schemas.openxmlformats.org/wordprocessingml/2006/main" xmlns:w14="http://schemas.microsoft.com/office/word/2010/wordml" xmlns:w15="http://schemas.microsoft.com/office/word/2012/wordml" xmlns:w16cex="http://schemas.microsoft.com/office/word/2018/wordml/cex" xmlns:w16cid="http://schemas.microsoft.com/office/word/2016/wordml/cid" xmlns:w16="http://schemas.microsoft.com/office/word/2018/wordml" xmlns:w16du="http://schemas.microsoft.com/office/word/2023/wordml/word16du" xmlns:w16sdtdh="http://schemas.microsoft.com/office/word/2020/wordml/sdtdatahash" xmlns:w16sdtfl="http://schemas.microsoft.com/office/word/2024/wordml/sdtformatlock" xmlns:w16se="http://schemas.microsoft.com/office/word/2015/wordml/symex" xmlns:wpg="http://schemas.microsoft.com/office/word/2010/wordprocessingGroup" xmlns:wpi="http://schemas.microsoft.com/office/word/2010/wordprocessingInk" xmlns:wne="http://schemas.microsoft.com/office/word/2006/wordml" xmlns:wps="http://schemas.microsoft.com/office/word/2010/wordprocessingShape" mc:Ignorable="w14 w15 w16se w16cid w16 w16cex w16sdtdh w16sdtfl w16du wp14">
+  <w:abstractNum w:abstractNumId="0" w15:restartNumberingAfterBreak="0">
+    <w:nsid w:val="5E0F2BEA"/>
+    <w:multiLevelType w:val="hybridMultilevel"/>
+    <w:tmpl w:val="DA907802"/>
+    <w:lvl w:ilvl="0" w:tplc="40090001">
+      <w:start w:val="1"/>
+      <w:numFmt w:val="bullet"/>
+      <w:lvlText w:val=""/>
+      <w:lvlJc w:val="left"/>
+      <w:pPr>
+        <w:ind w:left="720" w:hanging="360"/>
+      </w:pPr>
+      <w:rPr>
+        <w:rFonts w:ascii="Symbol" w:hAnsi="Symbol" w:hint="default"/>
+      </w:rPr>
+    </w:lvl>
+    <w:lvl w:ilvl="1" w:tplc="40090003" w:tentative="1">
+      <w:start w:val="1"/>
+      <w:numFmt w:val="bullet"/>
+      <w:lvlText w:val="o"/>
+      <w:lvlJc w:val="left"/>
+      <w:pPr>
+        <w:ind w:left="1440" w:hanging="360"/>
+      </w:pPr>
+      <w:rPr>
+        <w:rFonts w:ascii="Courier New" w:hAnsi="Courier New" w:cs="Courier New" w:hint="default"/>
+      </w:rPr>
+    </w:lvl>
+    <w:lvl w:ilvl="2" w:tplc="40090005" w:tentative="1">
+      <w:start w:val="1"/>
+      <w:numFmt w:val="bullet"/>
+      <w:lvlText w:val=""/>
+      <w:lvlJc w:val="left"/>
+      <w:pPr>
+        <w:ind w:left="2160" w:hanging="360"/>
+      </w:pPr>
+      <w:rPr>
+        <w:rFonts w:ascii="Wingdings" w:hAnsi="Wingdings" w:hint="default"/>
+      </w:rPr>
+    </w:lvl>
+    <w:lvl w:ilvl="3" w:tplc="40090001" w:tentative="1">
+      <w:start w:val="1"/>
+      <w:numFmt w:val="bullet"/>
+      <w:lvlText w:val=""/>
+      <w:lvlJc w:val="left"/>
+      <w:pPr>
+        <w:ind w:left="2880" w:hanging="360"/>
+      </w:pPr>
+      <w:rPr>
+        <w:rFonts w:ascii="Symbol" w:hAnsi="Symbol" w:hint="default"/>
+      </w:rPr>
+    </w:lvl>
+    <w:lvl w:ilvl="4" w:tplc="40090003" w:tentative="1">
+      <w:start w:val="1"/>
+      <w:numFmt w:val="bullet"/>
+      <w:lvlText w:val="o"/>
+      <w:lvlJc w:val="left"/>
+      <w:pPr>
+        <w:ind w:left="3600" w:hanging="360"/>
+      </w:pPr>
+      <w:rPr>
+        <w:rFonts w:ascii="Courier New" w:hAnsi="Courier New" w:cs="Courier New" w:hint="default"/>
+      </w:rPr>
+    </w:lvl>
+    <w:lvl w:ilvl="5" w:tplc="40090005" w:tentative="1">
+      <w:start w:val="1"/>
+      <w:numFmt w:val="bullet"/>
+      <w:lvlText w:val=""/>
+      <w:lvlJc w:val="left"/>
+      <w:pPr>
+        <w:ind w:left="4320" w:hanging="360"/>
+      </w:pPr>
+      <w:rPr>
+        <w:rFonts w:ascii="Wingdings" w:hAnsi="Wingdings" w:hint="default"/>
+      </w:rPr>
+    </w:lvl>
+    <w:lvl w:ilvl="6" w:tplc="40090001" w:tentative="1">
+      <w:start w:val="1"/>
+      <w:numFmt w:val="bullet"/>
+      <w:lvlText w:val=""/>
+      <w:lvlJc w:val="left"/>
+      <w:pPr>
+        <w:ind w:left="5040" w:hanging="360"/>
+      </w:pPr>
+      <w:rPr>
+        <w:rFonts w:ascii="Symbol" w:hAnsi="Symbol" w:hint="default"/>
+      </w:rPr>
+    </w:lvl>
+    <w:lvl w:ilvl="7" w:tplc="40090003" w:tentative="1">
+      <w:start w:val="1"/>
+      <w:numFmt w:val="bullet"/>
+      <w:lvlText w:val="o"/>
+      <w:lvlJc w:val="left"/>
+      <w:pPr>
+        <w:ind w:left="5760" w:hanging="360"/>
+      </w:pPr>
+      <w:rPr>
+        <w:rFonts w:ascii="Courier New" w:hAnsi="Courier New" w:cs="Courier New" w:hint="default"/>
+      </w:rPr>
+    </w:lvl>
+    <w:lvl w:ilvl="8" w:tplc="40090005" w:tentative="1">
+      <w:start w:val="1"/>
+      <w:numFmt w:val="bullet"/>
+      <w:lvlText w:val=""/>
+      <w:lvlJc w:val="left"/>
+      <w:pPr>
+        <w:ind w:left="6480" w:hanging="360"/>
+      </w:pPr>
+      <w:rPr>
+        <w:rFonts w:ascii="Wingdings" w:hAnsi="Wingdings" w:hint="default"/>
+      </w:rPr>
+    </w:lvl>
+  </w:abstractNum>
+  <w:num w:numId="1" w16cid:durableId="680594985">
+    <w:abstractNumId w:val="0"/>
+  </w:num>
+</w:numbering>
 </file>
 
 <file path=word/styles.xml><?xml version="1.0" encoding="utf-8"?>
@@ -1059,7 +2683,7 @@
   <w:style w:type="paragraph" w:default="1" w:styleId="Normal">
     <w:name w:val="Normal"/>
     <w:qFormat/>
-    <w:rsid w:val="002C3B54"/>
+    <w:rsid w:val="00A61838"/>
   </w:style>
   <w:style w:type="paragraph" w:styleId="Heading1">
     <w:name w:val="heading 1"/>

</xml_diff>